<commit_message>
Rebuild teaching downloads with the WVU DSPIRA templates
</commit_message>
<xml_diff>
--- a/assets/lessons/observation-planning/stellarium-teacher-notes.docx
+++ b/assets/lessons/observation-planning/stellarium-teacher-notes.docx
@@ -1,274 +1,114 @@
 
 <file path=word/document.xml><?xml version="1.0" encoding="utf-8"?>
-<w:document xmlns:mc="http://schemas.openxmlformats.org/markup-compatibility/2006" xmlns:o="urn:schemas-microsoft-com:office:office" xmlns:r="http://schemas.openxmlformats.org/officeDocument/2006/relationships" xmlns:m="http://schemas.openxmlformats.org/officeDocument/2006/math" xmlns:v="urn:schemas-microsoft-com:vml" xmlns:wp="http://schemas.openxmlformats.org/drawingml/2006/wordprocessingDrawing" xmlns:w10="urn:schemas-microsoft-com:office:word" xmlns:w="http://schemas.openxmlformats.org/wordprocessingml/2006/main" xmlns:wne="http://schemas.microsoft.com/office/word/2006/wordml" xmlns:sl="http://schemas.openxmlformats.org/schemaLibrary/2006/main" xmlns:a="http://schemas.openxmlformats.org/drawingml/2006/main" xmlns:pic="http://schemas.openxmlformats.org/drawingml/2006/picture" xmlns:c="http://schemas.openxmlformats.org/drawingml/2006/chart" xmlns:lc="http://schemas.openxmlformats.org/drawingml/2006/lockedCanvas" xmlns:dgm="http://schemas.openxmlformats.org/drawingml/2006/diagram" xmlns:wps="http://schemas.microsoft.com/office/word/2010/wordprocessingShape" xmlns:wpg="http://schemas.microsoft.com/office/word/2010/wordprocessingGroup" xmlns:w14="http://schemas.microsoft.com/office/word/2010/wordml" xmlns:w15="http://schemas.microsoft.com/office/word/2012/wordml" xmlns:w16="http://schemas.microsoft.com/office/word/2018/wordml" xmlns:w16cex="http://schemas.microsoft.com/office/word/2018/wordml/cex" xmlns:w16cid="http://schemas.microsoft.com/office/word/2016/wordml/cid" xmlns="http://schemas.microsoft.com/office/tasks/2019/documenttasks" xmlns:cr="http://schemas.microsoft.com/office/comments/2020/reactions">
+<w:document xmlns:wpc="http://schemas.microsoft.com/office/word/2010/wordprocessingCanvas" xmlns:cx="http://schemas.microsoft.com/office/drawing/2014/chartex" xmlns:cx1="http://schemas.microsoft.com/office/drawing/2015/9/8/chartex" xmlns:cx2="http://schemas.microsoft.com/office/drawing/2015/10/21/chartex" xmlns:cx3="http://schemas.microsoft.com/office/drawing/2016/5/9/chartex" xmlns:cx4="http://schemas.microsoft.com/office/drawing/2016/5/10/chartex" xmlns:cx5="http://schemas.microsoft.com/office/drawing/2016/5/11/chartex" xmlns:cx6="http://schemas.microsoft.com/office/drawing/2016/5/12/chartex" xmlns:cx7="http://schemas.microsoft.com/office/drawing/2016/5/13/chartex" xmlns:cx8="http://schemas.microsoft.com/office/drawing/2016/5/14/chartex" xmlns:mc="http://schemas.openxmlformats.org/markup-compatibility/2006" xmlns:aink="http://schemas.microsoft.com/office/drawing/2016/ink" xmlns:am3d="http://schemas.microsoft.com/office/drawing/2017/model3d" xmlns:o="urn:schemas-microsoft-com:office:office" xmlns:oel="http://schemas.microsoft.com/office/2019/extlst" xmlns:r="http://schemas.openxmlformats.org/officeDocument/2006/relationships" xmlns:m="http://schemas.openxmlformats.org/officeDocument/2006/math" xmlns:v="urn:schemas-microsoft-com:vml" xmlns:wp14="http://schemas.microsoft.com/office/word/2010/wordprocessingDrawing" xmlns:wp="http://schemas.openxmlformats.org/drawingml/2006/wordprocessingDrawing" xmlns:w10="urn:schemas-microsoft-com:office:word" xmlns:w="http://schemas.openxmlformats.org/wordprocessingml/2006/main" xmlns:w14="http://schemas.microsoft.com/office/word/2010/wordml" xmlns:w15="http://schemas.microsoft.com/office/word/2012/wordml" xmlns:w16cex="http://schemas.microsoft.com/office/word/2018/wordml/cex" xmlns:w16cid="http://schemas.microsoft.com/office/word/2016/wordml/cid" xmlns:w16="http://schemas.microsoft.com/office/word/2018/wordml" xmlns:w16du="http://schemas.microsoft.com/office/word/2023/wordml/word16du" xmlns:w16sdtdh="http://schemas.microsoft.com/office/word/2020/wordml/sdtdatahash" xmlns:w16sdtfl="http://schemas.microsoft.com/office/word/2024/wordml/sdtformatlock" xmlns:w16se="http://schemas.microsoft.com/office/word/2015/wordml/symex" xmlns:wpg="http://schemas.microsoft.com/office/word/2010/wordprocessingGroup" xmlns:wpi="http://schemas.microsoft.com/office/word/2010/wordprocessingInk" xmlns:wne="http://schemas.microsoft.com/office/word/2006/wordml" xmlns:wps="http://schemas.microsoft.com/office/word/2010/wordprocessingShape" mc:Ignorable="w14 w15 w16se w16cid w16 w16cex w16sdtdh w16sdtfl w16du wp14">
   <w:body>
     <w:p>
       <w:pPr>
         <w:pStyle w:val="Title"/>
         <w:keepNext/>
-        <w:spacing w:before="0" w:line="264" w:lineRule="auto" w:after="160"/>
-        <w:jc w:val="left"/>
         <w:rPr>
-          <w:rFonts w:ascii="Arial" w:cs="Arial" w:eastAsia="Arial" w:hAnsi="Arial"/>
-          <w:b w:val="1"/>
-          <w:bCs w:val="1"/>
+          <w:b/>
+          <w:bCs/>
           <w:sz w:val="24"/>
           <w:szCs w:val="24"/>
         </w:rPr>
       </w:pPr>
       <w:r>
-        <w:rPr>
-          <w:rFonts w:ascii="Arial" w:cs="Arial" w:eastAsia="Arial" w:hAnsi="Arial"/>
-          <w:b/>
-          <w:bCs w:val="1"/>
-          <w:i w:val="0"/>
-          <w:iCs w:val="0"/>
-          <w:color w:val="000000"/>
-          <w:sz w:val="48"/>
-          <w:szCs w:val="22"/>
-          <w:u w:val="none"/>
-          <w:rtl w:val="0"/>
-        </w:rPr>
-        <w:t xml:space="preserve">Observing Celestial Coordinate Systems using Stellarium?</w:t>
-      </w:r>
-      <w:r>
-        <w:rPr>
-          <w:u w:val="none"/>
-          <w:rtl w:val="0"/>
-          <w:rFonts w:ascii="Arial" w:hAnsi="Arial" w:cs="Arial" w:eastAsia="Arial"/>
-          <w:color w:val="000000"/>
-          <w:sz w:val="48"/>
-          <w:szCs w:val="22"/>
-          <w:b/>
-          <w:i w:val="0"/>
-          <w:iCs w:val="0"/>
-        </w:rPr>
+        <w:t>Observing Celestial Coordinate Systems using Stellarium?</w:t>
       </w:r>
     </w:p>
     <w:p>
       <w:pPr>
         <w:pStyle w:val="Subtitle"/>
-        <w:spacing w:line="264" w:lineRule="auto" w:after="80"/>
-        <w:jc w:val="left"/>
+        <w:keepNext/>
         <w:rPr>
-          <w:rFonts w:ascii="Arial" w:cs="Arial" w:eastAsia="Arial" w:hAnsi="Arial"/>
-          <w:b w:val="1"/>
-          <w:bCs w:val="1"/>
-          <w:i w:val="1"/>
-          <w:iCs w:val="1"/>
+          <w:b/>
+          <w:bCs/>
+          <w:i/>
           <w:sz w:val="26"/>
           <w:szCs w:val="26"/>
         </w:rPr>
       </w:pPr>
       <w:r>
-        <w:rPr>
-          <w:rFonts w:ascii="Arial" w:cs="Arial" w:eastAsia="Arial" w:hAnsi="Arial"/>
-          <w:b w:val="0"/>
-          <w:bCs w:val="1"/>
-          <w:i w:val="0"/>
-          <w:iCs w:val="0"/>
-          <w:sz w:val="22"/>
-          <w:szCs w:val="22"/>
-          <w:rtl w:val="0"/>
-        </w:rPr>
         <w:t xml:space="preserve"> Astronomy Activity</w:t>
       </w:r>
     </w:p>
     <w:p>
       <w:pPr>
         <w:pStyle w:val="Subtitle"/>
-        <w:spacing w:before="120" w:line="264" w:lineRule="auto" w:after="80"/>
-        <w:jc w:val="left"/>
+        <w:keepNext/>
         <w:rPr>
-          <w:rFonts w:ascii="Arial" w:cs="Arial" w:eastAsia="Arial" w:hAnsi="Arial"/>
-          <w:i w:val="1"/>
-          <w:iCs w:val="1"/>
+          <w:i/>
           <w:sz w:val="28"/>
           <w:szCs w:val="28"/>
         </w:rPr>
       </w:pPr>
       <w:r>
-        <w:rPr>
-          <w:rFonts w:ascii="Arial" w:cs="Arial" w:eastAsia="Arial" w:hAnsi="Arial"/>
-          <w:b w:val="0"/>
-          <w:i w:val="0"/>
-          <w:iCs w:val="0"/>
-          <w:color w:val="000000"/>
-          <w:sz w:val="22"/>
-          <w:szCs w:val="22"/>
-          <w:rtl w:val="0"/>
-        </w:rPr>
-        <w:t xml:space="preserve">TEACHER NOTES</w:t>
-      </w:r>
-      <w:r>
-        <w:rPr>
-          <w:rtl w:val="0"/>
-          <w:rFonts w:ascii="Arial" w:hAnsi="Arial" w:cs="Arial" w:eastAsia="Arial"/>
-          <w:color w:val="000000"/>
-          <w:sz w:val="22"/>
-          <w:szCs w:val="22"/>
-          <w:b w:val="0"/>
-          <w:i w:val="0"/>
-          <w:iCs w:val="0"/>
-        </w:rPr>
+        <w:t>TEACHER NOTES</w:t>
       </w:r>
     </w:p>
     <w:p>
       <w:pPr>
-        <w:spacing w:before="360" w:lineRule="auto" w:line="264" w:after="80"/>
+        <w:spacing w:before="360"/>
         <w:rPr>
-          <w:rFonts w:ascii="Arial" w:cs="Arial" w:eastAsia="Arial" w:hAnsi="Arial"/>
-          <w:color w:val="ff0000"/>
+          <w:color w:val="FF0000"/>
         </w:rPr>
       </w:pPr>
       <w:r>
         <w:rPr>
-          <w:rFonts w:ascii="Arial" w:cs="Arial" w:eastAsia="Arial" w:hAnsi="Arial"/>
-          <w:color w:val="ff0000"/>
-          <w:rtl w:val="0"/>
-          <w:sz w:val="22"/>
-          <w:szCs w:val="22"/>
-          <w:i w:val="0"/>
-          <w:iCs w:val="0"/>
+          <w:color w:val="FF0000"/>
         </w:rPr>
-        <w:t xml:space="preserve">Warning: </w:t>
-      </w:r>
-      <w:r>
-        <w:rPr>
-          <w:rFonts w:ascii="Arial" w:cs="Arial" w:eastAsia="Arial" w:hAnsi="Arial"/>
-          <w:i w:val="0"/>
-          <w:iCs w:val="0"/>
-          <w:color w:val="ff0000"/>
-          <w:rtl w:val="0"/>
-          <w:sz w:val="22"/>
-          <w:szCs w:val="22"/>
-        </w:rPr>
-        <w:t xml:space="preserve">Upon opening the Stellarium Web Online site, you (the students) will be asked if you will allow your location to be shared. There may be a school policy that has a say about such things. </w:t>
-      </w:r>
-      <w:r>
-        <w:rPr>
-          <w:rFonts w:ascii="Arial" w:cs="Arial" w:eastAsia="Arial" w:hAnsi="Arial"/>
-          <w:color w:val="ff0000"/>
-          <w:rtl w:val="0"/>
-          <w:sz w:val="22"/>
-          <w:szCs w:val="22"/>
-          <w:i w:val="0"/>
-          <w:iCs w:val="0"/>
-        </w:rPr>
-        <w:t xml:space="preserve"> </w:t>
+        <w:t xml:space="preserve">Warning: Upon opening the Stellarium Web Online site, you (the students) will be asked if you will allow your location to be shared. There may be a school policy that has a say about such things.  </w:t>
       </w:r>
     </w:p>
     <w:p>
       <w:pPr>
-        <w:spacing w:before="360" w:lineRule="auto" w:line="264" w:after="80"/>
+        <w:spacing w:before="360"/>
         <w:rPr>
-          <w:rFonts w:ascii="Arial" w:cs="Arial" w:eastAsia="Arial" w:hAnsi="Arial"/>
-          <w:b w:val="1"/>
-          <w:bCs w:val="1"/>
+          <w:b/>
+          <w:bCs/>
         </w:rPr>
       </w:pPr>
       <w:r>
         <w:rPr>
-          <w:rFonts w:ascii="Arial" w:cs="Arial" w:eastAsia="Arial" w:hAnsi="Arial"/>
-          <w:b w:val="1"/>
-          <w:bCs w:val="1"/>
-          <w:rtl w:val="0"/>
-          <w:sz w:val="22"/>
-          <w:szCs w:val="22"/>
-          <w:i w:val="0"/>
-          <w:iCs w:val="0"/>
+          <w:b/>
+          <w:bCs/>
         </w:rPr>
-        <w:t xml:space="preserve">Level:</w:t>
-      </w:r>
-      <w:r>
-        <w:rPr>
-          <w:rFonts w:ascii="Arial" w:cs="Arial" w:eastAsia="Arial" w:hAnsi="Arial"/>
-          <w:i w:val="0"/>
-          <w:iCs w:val="0"/>
-          <w:rtl w:val="0"/>
-          <w:sz w:val="22"/>
-          <w:szCs w:val="22"/>
-        </w:rPr>
+        <w:t>Level:</w:t>
+      </w:r>
+      <w:r>
         <w:t xml:space="preserve"> Introductory at Middle School or High School</w:t>
-      </w:r>
-      <w:r>
-        <w:rPr>
-          <w:rtl w:val="0"/>
-          <w:rFonts w:ascii="Arial" w:hAnsi="Arial" w:cs="Arial" w:eastAsia="Arial"/>
-          <w:sz w:val="22"/>
-          <w:szCs w:val="22"/>
-          <w:i w:val="0"/>
-          <w:iCs w:val="0"/>
-        </w:rPr>
       </w:r>
     </w:p>
     <w:p>
       <w:pPr>
-        <w:spacing w:after="80" w:before="120" w:lineRule="auto" w:line="264"/>
+        <w:spacing w:before="120"/>
         <w:rPr>
-          <w:rFonts w:ascii="Arial" w:cs="Arial" w:eastAsia="Arial" w:hAnsi="Arial"/>
-          <w:i w:val="1"/>
-          <w:iCs w:val="1"/>
+          <w:i/>
+          <w:iCs/>
         </w:rPr>
       </w:pPr>
       <w:r>
         <w:rPr>
-          <w:rFonts w:ascii="Arial" w:cs="Arial" w:eastAsia="Arial" w:hAnsi="Arial"/>
-          <w:b w:val="1"/>
-          <w:bCs w:val="1"/>
-          <w:rtl w:val="0"/>
-          <w:sz w:val="22"/>
-          <w:szCs w:val="22"/>
-          <w:i w:val="0"/>
-          <w:iCs w:val="0"/>
+          <w:b/>
+          <w:bCs/>
         </w:rPr>
-        <w:t xml:space="preserve">Objective:</w:t>
-      </w:r>
-      <w:r>
-        <w:rPr>
-          <w:rFonts w:ascii="Arial" w:cs="Arial" w:eastAsia="Arial" w:hAnsi="Arial"/>
-          <w:i w:val="0"/>
-          <w:iCs w:val="0"/>
-          <w:rtl w:val="0"/>
-          <w:sz w:val="22"/>
-          <w:szCs w:val="22"/>
-        </w:rPr>
+        <w:t>Objective:</w:t>
+      </w:r>
+      <w:r>
         <w:t xml:space="preserve"> A fun, interactive activity to observe the Celestial Sphere with on online planetarium program, specifically, Stell</w:t>
       </w:r>
     </w:p>
     <w:p>
       <w:pPr>
-        <w:keepNext/>
-        <w:spacing w:after="80" w:before="120" w:lineRule="auto" w:line="264"/>
+        <w:pStyle w:val="Heading2"/>
         <w:rPr>
-          <w:rFonts w:ascii="Arial" w:cs="Arial" w:eastAsia="Arial" w:hAnsi="Arial"/>
-          <w:i w:val="1"/>
-          <w:iCs w:val="1"/>
+          <w:i/>
+          <w:iCs/>
         </w:rPr>
       </w:pPr>
       <w:r>
-        <w:rPr>
-          <w:rFonts w:ascii="Arial" w:cs="Arial" w:eastAsia="Arial" w:hAnsi="Arial"/>
-          <w:b w:val="1"/>
-          <w:bCs w:val="1"/>
-          <w:rtl w:val="0"/>
-          <w:sz w:val="22"/>
-          <w:szCs w:val="22"/>
-          <w:i w:val="0"/>
-          <w:iCs w:val="0"/>
-        </w:rPr>
-        <w:t xml:space="preserve">Pre-Knowledge of Students:</w:t>
-      </w:r>
-      <w:r>
-        <w:rPr>
-          <w:rFonts w:ascii="Arial" w:cs="Arial" w:eastAsia="Arial" w:hAnsi="Arial"/>
-          <w:i w:val="0"/>
-          <w:iCs w:val="0"/>
-          <w:rtl w:val="0"/>
-          <w:sz w:val="22"/>
-          <w:szCs w:val="22"/>
-        </w:rPr>
-        <w:t xml:space="preserve"> </w:t>
+        <w:t xml:space="preserve">Pre-Knowledge of Students: </w:t>
       </w:r>
     </w:p>
     <w:p>
@@ -277,25 +117,14 @@
           <w:ilvl w:val="0"/>
           <w:numId w:val="1"/>
         </w:numPr>
-        <w:spacing w:after="80" w:afterAutospacing="0" w:before="120" w:lineRule="auto" w:line="264"/>
-        <w:ind w:left="720" w:hanging="360"/>
+        <w:spacing w:before="120"/>
         <w:rPr>
-          <w:rFonts w:ascii="Arial" w:cs="Arial" w:eastAsia="Arial" w:hAnsi="Arial"/>
-          <w:i w:val="1"/>
-          <w:iCs w:val="1"/>
-          <w:u w:val="none"/>
+          <w:i/>
+          <w:iCs/>
         </w:rPr>
       </w:pPr>
       <w:r>
-        <w:rPr>
-          <w:rFonts w:ascii="Arial" w:cs="Arial" w:eastAsia="Arial" w:hAnsi="Arial"/>
-          <w:i w:val="0"/>
-          <w:iCs w:val="0"/>
-          <w:rtl w:val="0"/>
-          <w:sz w:val="22"/>
-          <w:szCs w:val="22"/>
-        </w:rPr>
-        <w:t xml:space="preserve">Very useful if this activity follows the DSPIRA Activity: Understanding Celestial Coordinate Systems</w:t>
+        <w:t>Very useful if this activity follows the DSPIRA Activity: Understanding Celestial Coordinate Systems</w:t>
       </w:r>
     </w:p>
     <w:p>
@@ -304,161 +133,67 @@
           <w:ilvl w:val="0"/>
           <w:numId w:val="1"/>
         </w:numPr>
-        <w:spacing w:after="80" w:before="0" w:beforeAutospacing="0" w:lineRule="auto" w:line="264"/>
-        <w:ind w:left="720" w:hanging="360"/>
         <w:rPr>
-          <w:rFonts w:ascii="Arial" w:cs="Arial" w:eastAsia="Arial" w:hAnsi="Arial"/>
-          <w:i w:val="1"/>
-          <w:iCs w:val="1"/>
-          <w:u w:val="none"/>
+          <w:i/>
+          <w:iCs/>
         </w:rPr>
       </w:pPr>
       <w:r>
-        <w:rPr>
-          <w:rFonts w:ascii="Arial" w:cs="Arial" w:eastAsia="Arial" w:hAnsi="Arial"/>
-          <w:i w:val="0"/>
-          <w:iCs w:val="0"/>
-          <w:rtl w:val="0"/>
-          <w:sz w:val="22"/>
-          <w:szCs w:val="22"/>
-        </w:rPr>
-        <w:t xml:space="preserve">The activity can be a stand alone</w:t>
+        <w:t>The activity can be a stand alone</w:t>
       </w:r>
     </w:p>
     <w:p>
       <w:pPr>
-        <w:spacing w:before="120" w:lineRule="auto" w:line="264" w:after="80"/>
+        <w:spacing w:before="120"/>
         <w:rPr>
-          <w:rFonts w:ascii="Arial" w:cs="Arial" w:eastAsia="Arial" w:hAnsi="Arial"/>
-          <w:i w:val="1"/>
-          <w:iCs w:val="1"/>
+          <w:i/>
+          <w:iCs/>
         </w:rPr>
       </w:pPr>
       <w:r>
         <w:rPr>
-          <w:rFonts w:ascii="Arial" w:cs="Arial" w:eastAsia="Arial" w:hAnsi="Arial"/>
-          <w:b w:val="1"/>
-          <w:bCs w:val="1"/>
-          <w:rtl w:val="0"/>
-          <w:sz w:val="22"/>
-          <w:szCs w:val="22"/>
-          <w:i w:val="0"/>
-          <w:iCs w:val="0"/>
+          <w:b/>
+          <w:bCs/>
         </w:rPr>
-        <w:t xml:space="preserve">Key Terms:</w:t>
-      </w:r>
-      <w:r>
-        <w:rPr>
-          <w:rFonts w:ascii="Arial" w:cs="Arial" w:eastAsia="Arial" w:hAnsi="Arial"/>
-          <w:i w:val="0"/>
-          <w:iCs w:val="0"/>
-          <w:rtl w:val="0"/>
-          <w:sz w:val="22"/>
-          <w:szCs w:val="22"/>
-        </w:rPr>
+        <w:t>Key Terms:</w:t>
+      </w:r>
+      <w:r>
         <w:t xml:space="preserve"> Celestial Sphere, Equatorial, Right Ascension, Declination,, Local Sky, Horizon, Zenith, Meridian, Azimuth, Altitude</w:t>
       </w:r>
     </w:p>
     <w:p>
       <w:pPr>
-        <w:keepNext/>
-        <w:spacing w:after="80" w:before="120" w:lineRule="auto" w:line="264"/>
-        <w:rPr>
-          <w:rFonts w:ascii="Arial" w:cs="Arial" w:eastAsia="Arial" w:hAnsi="Arial"/>
-        </w:rPr>
-      </w:pPr>
-      <w:r>
-        <w:rPr>
-          <w:rFonts w:ascii="Arial" w:cs="Arial" w:eastAsia="Arial" w:hAnsi="Arial"/>
-          <w:b w:val="1"/>
-          <w:bCs w:val="1"/>
-          <w:rtl w:val="0"/>
-          <w:sz w:val="22"/>
-          <w:szCs w:val="22"/>
-          <w:i w:val="0"/>
-          <w:iCs w:val="0"/>
-        </w:rPr>
-        <w:t xml:space="preserve">Related Videos for Teacher:</w:t>
-      </w:r>
-      <w:r>
-        <w:rPr>
-          <w:rFonts w:ascii="Arial" w:cs="Arial" w:eastAsia="Arial" w:hAnsi="Arial"/>
-          <w:rtl w:val="0"/>
-          <w:sz w:val="22"/>
-          <w:szCs w:val="22"/>
-          <w:i w:val="0"/>
-          <w:iCs w:val="0"/>
-        </w:rPr>
-        <w:t xml:space="preserve"> </w:t>
+        <w:pStyle w:val="Heading2"/>
+      </w:pPr>
+      <w:r>
+        <w:t xml:space="preserve">Related Videos for Teacher: </w:t>
       </w:r>
     </w:p>
     <w:p>
       <w:pPr>
         <w:keepNext/>
-        <w:spacing w:after="80" w:before="120" w:lineRule="auto" w:line="264"/>
-        <w:rPr>
-          <w:rFonts w:ascii="Arial" w:cs="Arial" w:eastAsia="Arial" w:hAnsi="Arial"/>
-        </w:rPr>
-      </w:pPr>
-      <w:hyperlink r:id="rId6">
+        <w:spacing w:before="120"/>
+      </w:pPr>
+      <w:hyperlink r:id="rId7">
         <w:r>
           <w:rPr>
-            <w:rFonts w:ascii="Arial" w:cs="Arial" w:eastAsia="Arial" w:hAnsi="Arial"/>
-            <w:color w:val="1155cc"/>
+            <w:color w:val="1155CC"/>
             <w:u w:val="single"/>
-            <w:rtl w:val="0"/>
-            <w:sz w:val="22"/>
-            <w:szCs w:val="22"/>
-            <w:i w:val="0"/>
-            <w:iCs w:val="0"/>
           </w:rPr>
           <w:t xml:space="preserve">DSPIRA Stellarium Tutorial </w:t>
         </w:r>
       </w:hyperlink>
-      <w:r>
-        <w:rPr>
-          <w:rtl w:val="0"/>
-          <w:rFonts w:ascii="Arial" w:hAnsi="Arial" w:cs="Arial" w:eastAsia="Arial"/>
-          <w:sz w:val="22"/>
-          <w:szCs w:val="22"/>
-          <w:i w:val="0"/>
-          <w:iCs w:val="0"/>
-        </w:rPr>
-      </w:r>
     </w:p>
     <w:p>
       <w:pPr>
-        <w:keepNext/>
-        <w:spacing w:after="80" w:before="120" w:lineRule="auto" w:line="264"/>
+        <w:pStyle w:val="Heading2"/>
         <w:rPr>
-          <w:rFonts w:ascii="Arial" w:cs="Arial" w:eastAsia="Arial" w:hAnsi="Arial"/>
-          <w:i w:val="1"/>
-          <w:iCs w:val="1"/>
+          <w:i/>
+          <w:iCs/>
         </w:rPr>
       </w:pPr>
       <w:r>
-        <w:rPr>
-          <w:rFonts w:ascii="Arial" w:cs="Arial" w:eastAsia="Arial" w:hAnsi="Arial"/>
-          <w:b w:val="1"/>
-          <w:bCs w:val="1"/>
-          <w:rtl w:val="0"/>
-          <w:sz w:val="22"/>
-          <w:szCs w:val="22"/>
-          <w:i w:val="0"/>
-          <w:iCs w:val="0"/>
-        </w:rPr>
-        <w:t xml:space="preserve">Teacher Preparation:</w:t>
-      </w:r>
-      <w:r>
-        <w:rPr>
-          <w:rFonts w:ascii="Arial" w:cs="Arial" w:eastAsia="Arial" w:hAnsi="Arial"/>
-          <w:i w:val="0"/>
-          <w:iCs w:val="0"/>
-          <w:rtl w:val="0"/>
-          <w:sz w:val="22"/>
-          <w:szCs w:val="22"/>
-        </w:rPr>
-        <w:t xml:space="preserve"> </w:t>
+        <w:t xml:space="preserve">Teacher Preparation: </w:t>
       </w:r>
     </w:p>
     <w:p>
@@ -467,60 +202,26 @@
           <w:ilvl w:val="0"/>
           <w:numId w:val="2"/>
         </w:numPr>
-        <w:spacing w:after="80" w:before="120" w:lineRule="auto" w:line="264"/>
-        <w:ind w:left="720" w:hanging="360"/>
+        <w:spacing w:before="120"/>
         <w:rPr>
-          <w:rFonts w:ascii="Arial" w:cs="Arial" w:eastAsia="Arial" w:hAnsi="Arial"/>
-          <w:i w:val="1"/>
-          <w:iCs w:val="1"/>
-          <w:u w:val="none"/>
+          <w:i/>
+          <w:iCs/>
         </w:rPr>
       </w:pPr>
       <w:r>
-        <w:rPr>
-          <w:rFonts w:ascii="Arial" w:cs="Arial" w:eastAsia="Arial" w:hAnsi="Arial"/>
-          <w:i w:val="0"/>
-          <w:iCs w:val="0"/>
-          <w:rtl w:val="0"/>
-          <w:sz w:val="22"/>
-          <w:szCs w:val="22"/>
-        </w:rPr>
-        <w:t xml:space="preserve">Watch the video tutorial links above, and spend about a ½ hour using the site to get comfortable with the Stellarium environment.</w:t>
+        <w:t>Watch the video tutorial links above, and spend about a ½ hour using the site to get comfortable with the Stellarium environment.</w:t>
       </w:r>
     </w:p>
     <w:p>
       <w:pPr>
-        <w:keepNext/>
-        <w:spacing w:after="80" w:before="120" w:lineRule="auto" w:line="264"/>
+        <w:pStyle w:val="Heading2"/>
         <w:rPr>
-          <w:rFonts w:ascii="Arial" w:cs="Arial" w:eastAsia="Arial" w:hAnsi="Arial"/>
-          <w:i w:val="1"/>
-          <w:iCs w:val="1"/>
+          <w:i/>
+          <w:iCs/>
         </w:rPr>
       </w:pPr>
       <w:r>
-        <w:rPr>
-          <w:rFonts w:ascii="Arial" w:cs="Arial" w:eastAsia="Arial" w:hAnsi="Arial"/>
-          <w:b w:val="1"/>
-          <w:bCs w:val="1"/>
-          <w:rtl w:val="0"/>
-          <w:sz w:val="22"/>
-          <w:szCs w:val="22"/>
-          <w:i w:val="0"/>
-          <w:iCs w:val="0"/>
-        </w:rPr>
-        <w:t xml:space="preserve">Activity Notes:</w:t>
-      </w:r>
-      <w:r>
-        <w:rPr>
-          <w:rFonts w:ascii="Arial" w:cs="Arial" w:eastAsia="Arial" w:hAnsi="Arial"/>
-          <w:i w:val="0"/>
-          <w:iCs w:val="0"/>
-          <w:rtl w:val="0"/>
-          <w:sz w:val="22"/>
-          <w:szCs w:val="22"/>
-        </w:rPr>
-        <w:t xml:space="preserve"> </w:t>
+        <w:t xml:space="preserve">Activity Notes: </w:t>
       </w:r>
     </w:p>
     <w:p>
@@ -529,77 +230,182 @@
           <w:ilvl w:val="1"/>
           <w:numId w:val="3"/>
         </w:numPr>
-        <w:spacing w:before="120" w:lineRule="auto" w:line="264" w:after="80"/>
-        <w:ind w:left="1080" w:hanging="360"/>
+        <w:spacing w:before="120"/>
+        <w:ind w:left="1080"/>
         <w:rPr>
-          <w:rFonts w:ascii="Arial" w:cs="Arial" w:eastAsia="Arial" w:hAnsi="Arial"/>
-          <w:i w:val="1"/>
-          <w:iCs w:val="1"/>
+          <w:i/>
+          <w:iCs/>
         </w:rPr>
       </w:pPr>
       <w:r>
-        <w:rPr>
-          <w:rFonts w:ascii="Arial" w:cs="Arial" w:eastAsia="Arial" w:hAnsi="Arial"/>
-          <w:i w:val="0"/>
-          <w:iCs w:val="0"/>
-          <w:rtl w:val="0"/>
-          <w:sz w:val="22"/>
-          <w:szCs w:val="22"/>
-        </w:rPr>
-        <w:t xml:space="preserve">Could easily be done in or out of class..</w:t>
+        <w:t>Could easily be done in or out of class..</w:t>
       </w:r>
     </w:p>
     <w:sectPr>
-      <w:headerReference r:id="rId7" w:type="default"/>
-      <w:footerReference w:type="default" r:id="rId8"/>
-      <w:pgSz w:h="15840" w:w="12240" w:orient="portrait"/>
-      <w:pgMar w:bottom="1080" w:top="1080" w:left="1080" w:right="1080" w:header="432" w:footer="432"/>
+      <w:headerReference w:type="even" r:id="rId8"/>
+      <w:headerReference w:type="default" r:id="rId9"/>
+      <w:footerReference w:type="even" r:id="rId10"/>
+      <w:footerReference w:type="default" r:id="rId11"/>
+      <w:headerReference w:type="first" r:id="rId12"/>
+      <w:footerReference w:type="first" r:id="rId13"/>
+      <w:pgSz w:w="12240" w:h="15840"/>
+      <w:pgMar w:top="1512" w:right="1080" w:bottom="1080" w:left="1080" w:header="432" w:footer="432" w:gutter="0"/>
       <w:pgNumType w:start="1"/>
+      <w:cols w:space="720"/>
     </w:sectPr>
   </w:body>
 </w:document>
 </file>
 
+<file path=word/endnotes.xml><?xml version="1.0" encoding="utf-8"?>
+<w:endnotes xmlns:wpc="http://schemas.microsoft.com/office/word/2010/wordprocessingCanvas" xmlns:cx="http://schemas.microsoft.com/office/drawing/2014/chartex" xmlns:cx1="http://schemas.microsoft.com/office/drawing/2015/9/8/chartex" xmlns:cx2="http://schemas.microsoft.com/office/drawing/2015/10/21/chartex" xmlns:cx3="http://schemas.microsoft.com/office/drawing/2016/5/9/chartex" xmlns:cx4="http://schemas.microsoft.com/office/drawing/2016/5/10/chartex" xmlns:cx5="http://schemas.microsoft.com/office/drawing/2016/5/11/chartex" xmlns:cx6="http://schemas.microsoft.com/office/drawing/2016/5/12/chartex" xmlns:cx7="http://schemas.microsoft.com/office/drawing/2016/5/13/chartex" xmlns:cx8="http://schemas.microsoft.com/office/drawing/2016/5/14/chartex" xmlns:mc="http://schemas.openxmlformats.org/markup-compatibility/2006" xmlns:aink="http://schemas.microsoft.com/office/drawing/2016/ink" xmlns:am3d="http://schemas.microsoft.com/office/drawing/2017/model3d" xmlns:o="urn:schemas-microsoft-com:office:office" xmlns:oel="http://schemas.microsoft.com/office/2019/extlst" xmlns:r="http://schemas.openxmlformats.org/officeDocument/2006/relationships" xmlns:m="http://schemas.openxmlformats.org/officeDocument/2006/math" xmlns:v="urn:schemas-microsoft-com:vml" xmlns:wp14="http://schemas.microsoft.com/office/word/2010/wordprocessingDrawing" xmlns:wp="http://schemas.openxmlformats.org/drawingml/2006/wordprocessingDrawing" xmlns:w10="urn:schemas-microsoft-com:office:word" xmlns:w="http://schemas.openxmlformats.org/wordprocessingml/2006/main" xmlns:w14="http://schemas.microsoft.com/office/word/2010/wordml" xmlns:w15="http://schemas.microsoft.com/office/word/2012/wordml" xmlns:w16cex="http://schemas.microsoft.com/office/word/2018/wordml/cex" xmlns:w16cid="http://schemas.microsoft.com/office/word/2016/wordml/cid" xmlns:w16="http://schemas.microsoft.com/office/word/2018/wordml" xmlns:w16du="http://schemas.microsoft.com/office/word/2023/wordml/word16du" xmlns:w16sdtdh="http://schemas.microsoft.com/office/word/2020/wordml/sdtdatahash" xmlns:w16sdtfl="http://schemas.microsoft.com/office/word/2024/wordml/sdtformatlock" xmlns:w16se="http://schemas.microsoft.com/office/word/2015/wordml/symex" xmlns:wpg="http://schemas.microsoft.com/office/word/2010/wordprocessingGroup" xmlns:wpi="http://schemas.microsoft.com/office/word/2010/wordprocessingInk" xmlns:wne="http://schemas.microsoft.com/office/word/2006/wordml" xmlns:wps="http://schemas.microsoft.com/office/word/2010/wordprocessingShape" mc:Ignorable="w14 w15 w16se w16cid w16 w16cex w16sdtdh w16sdtfl w16du wp14">
+  <w:endnote w:type="separator" w:id="-1">
+    <w:p>
+      <w:pPr>
+        <w:spacing w:after="0" w:line="240" w:lineRule="auto"/>
+      </w:pPr>
+      <w:r>
+        <w:separator/>
+      </w:r>
+    </w:p>
+  </w:endnote>
+  <w:endnote w:type="continuationSeparator" w:id="0">
+    <w:p>
+      <w:pPr>
+        <w:spacing w:after="0" w:line="240" w:lineRule="auto"/>
+      </w:pPr>
+      <w:r>
+        <w:continuationSeparator/>
+      </w:r>
+    </w:p>
+  </w:endnote>
+</w:endnotes>
+</file>
+
 <file path=word/footer1.xml><?xml version="1.0" encoding="utf-8"?>
-<w:ftr xmlns:m="http://schemas.openxmlformats.org/officeDocument/2006/math" xmlns:mc="http://schemas.openxmlformats.org/markup-compatibility/2006" xmlns:mo="http://schemas.microsoft.com/office/mac/office/2008/main" xmlns:mv="urn:schemas-microsoft-com:mac:vml" xmlns:o="urn:schemas-microsoft-com:office:office" xmlns:r="http://schemas.openxmlformats.org/officeDocument/2006/relationships" xmlns:v="urn:schemas-microsoft-com:vml" xmlns:w10="urn:schemas-microsoft-com:office:word" xmlns:w14="http://schemas.microsoft.com/office/word/2010/wordml" xmlns:w="http://schemas.openxmlformats.org/wordprocessingml/2006/main" xmlns:wne="http://schemas.microsoft.com/office/word/2006/wordml" xmlns:wp14="http://schemas.microsoft.com/office/word/2010/wordprocessingDrawing" xmlns:wp="http://schemas.openxmlformats.org/drawingml/2006/wordprocessingDrawing" xmlns:wpc="http://schemas.microsoft.com/office/word/2010/wordprocessingCanvas" xmlns:wpg="http://schemas.microsoft.com/office/word/2010/wordprocessingGroup" xmlns:wpi="http://schemas.microsoft.com/office/word/2010/wordprocessingInk" xmlns:wps="http://schemas.microsoft.com/office/word/2010/wordprocessingShape" mc:Ignorable="w14 wp14">
+<w:ftr xmlns:wpc="http://schemas.microsoft.com/office/word/2010/wordprocessingCanvas" xmlns:cx="http://schemas.microsoft.com/office/drawing/2014/chartex" xmlns:cx1="http://schemas.microsoft.com/office/drawing/2015/9/8/chartex" xmlns:cx2="http://schemas.microsoft.com/office/drawing/2015/10/21/chartex" xmlns:cx3="http://schemas.microsoft.com/office/drawing/2016/5/9/chartex" xmlns:cx4="http://schemas.microsoft.com/office/drawing/2016/5/10/chartex" xmlns:cx5="http://schemas.microsoft.com/office/drawing/2016/5/11/chartex" xmlns:cx6="http://schemas.microsoft.com/office/drawing/2016/5/12/chartex" xmlns:cx7="http://schemas.microsoft.com/office/drawing/2016/5/13/chartex" xmlns:cx8="http://schemas.microsoft.com/office/drawing/2016/5/14/chartex" xmlns:mc="http://schemas.openxmlformats.org/markup-compatibility/2006" xmlns:aink="http://schemas.microsoft.com/office/drawing/2016/ink" xmlns:am3d="http://schemas.microsoft.com/office/drawing/2017/model3d" xmlns:o="urn:schemas-microsoft-com:office:office" xmlns:oel="http://schemas.microsoft.com/office/2019/extlst" xmlns:r="http://schemas.openxmlformats.org/officeDocument/2006/relationships" xmlns:m="http://schemas.openxmlformats.org/officeDocument/2006/math" xmlns:v="urn:schemas-microsoft-com:vml" xmlns:wp14="http://schemas.microsoft.com/office/word/2010/wordprocessingDrawing" xmlns:wp="http://schemas.openxmlformats.org/drawingml/2006/wordprocessingDrawing" xmlns:w10="urn:schemas-microsoft-com:office:word" xmlns:w="http://schemas.openxmlformats.org/wordprocessingml/2006/main" xmlns:w14="http://schemas.microsoft.com/office/word/2010/wordml" xmlns:w15="http://schemas.microsoft.com/office/word/2012/wordml" xmlns:w16cex="http://schemas.microsoft.com/office/word/2018/wordml/cex" xmlns:w16cid="http://schemas.microsoft.com/office/word/2016/wordml/cid" xmlns:w16="http://schemas.microsoft.com/office/word/2018/wordml" xmlns:w16du="http://schemas.microsoft.com/office/word/2023/wordml/word16du" xmlns:w16sdtdh="http://schemas.microsoft.com/office/word/2020/wordml/sdtdatahash" xmlns:w16sdtfl="http://schemas.microsoft.com/office/word/2024/wordml/sdtformatlock" xmlns:w16se="http://schemas.microsoft.com/office/word/2015/wordml/symex" xmlns:wpg="http://schemas.microsoft.com/office/word/2010/wordprocessingGroup" xmlns:wpi="http://schemas.microsoft.com/office/word/2010/wordprocessingInk" xmlns:wne="http://schemas.microsoft.com/office/word/2006/wordml" xmlns:wps="http://schemas.microsoft.com/office/word/2010/wordprocessingShape" mc:Ignorable="w14 w15 w16se w16cid w16 w16cex w16sdtdh w16sdtfl w16du wp14">
   <w:p>
     <w:pPr>
-      <w:pStyle w:val="footer"/>
-      <w:tabs>
-        <w:tab w:pos="10080" w:val="right"/>
-      </w:tabs>
-    </w:pPr>
-    <w:r>
-      <w:t>wvurail.org/dspira</w:t>
-      <w:tab/>
-      <w:t xml:space="preserve">Page </w:t>
-    </w:r>
-    <w:fldSimple w:instr="PAGE"/>
-    <w:r>
-      <w:t xml:space="preserve"> of </w:t>
-    </w:r>
-    <w:fldSimple w:instr="NUMPAGES"/>
+      <w:pStyle w:val="Footer"/>
+    </w:pPr>
   </w:p>
 </w:ftr>
 </file>
 
+<file path=word/footer2.xml><?xml version="1.0" encoding="utf-8"?>
+<w:ftr xmlns:wpc="http://schemas.microsoft.com/office/word/2010/wordprocessingCanvas" xmlns:cx="http://schemas.microsoft.com/office/drawing/2014/chartex" xmlns:cx1="http://schemas.microsoft.com/office/drawing/2015/9/8/chartex" xmlns:cx2="http://schemas.microsoft.com/office/drawing/2015/10/21/chartex" xmlns:cx3="http://schemas.microsoft.com/office/drawing/2016/5/9/chartex" xmlns:cx4="http://schemas.microsoft.com/office/drawing/2016/5/10/chartex" xmlns:cx5="http://schemas.microsoft.com/office/drawing/2016/5/11/chartex" xmlns:cx6="http://schemas.microsoft.com/office/drawing/2016/5/12/chartex" xmlns:cx7="http://schemas.microsoft.com/office/drawing/2016/5/13/chartex" xmlns:cx8="http://schemas.microsoft.com/office/drawing/2016/5/14/chartex" xmlns:mc="http://schemas.openxmlformats.org/markup-compatibility/2006" xmlns:aink="http://schemas.microsoft.com/office/drawing/2016/ink" xmlns:am3d="http://schemas.microsoft.com/office/drawing/2017/model3d" xmlns:o="urn:schemas-microsoft-com:office:office" xmlns:oel="http://schemas.microsoft.com/office/2019/extlst" xmlns:r="http://schemas.openxmlformats.org/officeDocument/2006/relationships" xmlns:m="http://schemas.openxmlformats.org/officeDocument/2006/math" xmlns:v="urn:schemas-microsoft-com:vml" xmlns:wp14="http://schemas.microsoft.com/office/word/2010/wordprocessingDrawing" xmlns:wp="http://schemas.openxmlformats.org/drawingml/2006/wordprocessingDrawing" xmlns:w10="urn:schemas-microsoft-com:office:word" xmlns:w="http://schemas.openxmlformats.org/wordprocessingml/2006/main" xmlns:w14="http://schemas.microsoft.com/office/word/2010/wordml" xmlns:w15="http://schemas.microsoft.com/office/word/2012/wordml" xmlns:w16cex="http://schemas.microsoft.com/office/word/2018/wordml/cex" xmlns:w16cid="http://schemas.microsoft.com/office/word/2016/wordml/cid" xmlns:w16="http://schemas.microsoft.com/office/word/2018/wordml" xmlns:w16du="http://schemas.microsoft.com/office/word/2023/wordml/word16du" xmlns:w16sdtdh="http://schemas.microsoft.com/office/word/2020/wordml/sdtdatahash" xmlns:w16sdtfl="http://schemas.microsoft.com/office/word/2024/wordml/sdtformatlock" xmlns:w16se="http://schemas.microsoft.com/office/word/2015/wordml/symex" xmlns:wpg="http://schemas.microsoft.com/office/word/2010/wordprocessingGroup" xmlns:wpi="http://schemas.microsoft.com/office/word/2010/wordprocessingInk" xmlns:wne="http://schemas.microsoft.com/office/word/2006/wordml" xmlns:wps="http://schemas.microsoft.com/office/word/2010/wordprocessingShape" mc:Ignorable="w14 w15 w16se w16cid w16 w16cex w16sdtdh w16sdtfl w16du wp14">
+  <w:p>
+    <w:pPr>
+      <w:pStyle w:val="Footer"/>
+      <w:tabs>
+        <w:tab w:val="right" w:pos="10080"/>
+      </w:tabs>
+    </w:pPr>
+    <w:r>
+      <w:t>wvurail.org/dspira</w:t>
+    </w:r>
+    <w:r>
+      <w:tab/>
+      <w:t xml:space="preserve">Page </w:t>
+    </w:r>
+    <w:r>
+      <w:fldChar w:fldCharType="begin"/>
+    </w:r>
+    <w:r>
+      <w:instrText>PAGE</w:instrText>
+    </w:r>
+    <w:r>
+      <w:fldChar w:fldCharType="separate"/>
+    </w:r>
+    <w:r>
+      <w:t>1</w:t>
+    </w:r>
+    <w:r>
+      <w:fldChar w:fldCharType="end"/>
+    </w:r>
+    <w:r>
+      <w:t xml:space="preserve"> of </w:t>
+    </w:r>
+    <w:r>
+      <w:fldChar w:fldCharType="begin"/>
+    </w:r>
+    <w:r>
+      <w:instrText>NUMPAGES</w:instrText>
+    </w:r>
+    <w:r>
+      <w:fldChar w:fldCharType="separate"/>
+    </w:r>
+    <w:r>
+      <w:t>2</w:t>
+    </w:r>
+    <w:r>
+      <w:fldChar w:fldCharType="end"/>
+    </w:r>
+  </w:p>
+</w:ftr>
+</file>
+
+<file path=word/footer3.xml><?xml version="1.0" encoding="utf-8"?>
+<w:ftr xmlns:wpc="http://schemas.microsoft.com/office/word/2010/wordprocessingCanvas" xmlns:cx="http://schemas.microsoft.com/office/drawing/2014/chartex" xmlns:cx1="http://schemas.microsoft.com/office/drawing/2015/9/8/chartex" xmlns:cx2="http://schemas.microsoft.com/office/drawing/2015/10/21/chartex" xmlns:cx3="http://schemas.microsoft.com/office/drawing/2016/5/9/chartex" xmlns:cx4="http://schemas.microsoft.com/office/drawing/2016/5/10/chartex" xmlns:cx5="http://schemas.microsoft.com/office/drawing/2016/5/11/chartex" xmlns:cx6="http://schemas.microsoft.com/office/drawing/2016/5/12/chartex" xmlns:cx7="http://schemas.microsoft.com/office/drawing/2016/5/13/chartex" xmlns:cx8="http://schemas.microsoft.com/office/drawing/2016/5/14/chartex" xmlns:mc="http://schemas.openxmlformats.org/markup-compatibility/2006" xmlns:aink="http://schemas.microsoft.com/office/drawing/2016/ink" xmlns:am3d="http://schemas.microsoft.com/office/drawing/2017/model3d" xmlns:o="urn:schemas-microsoft-com:office:office" xmlns:oel="http://schemas.microsoft.com/office/2019/extlst" xmlns:r="http://schemas.openxmlformats.org/officeDocument/2006/relationships" xmlns:m="http://schemas.openxmlformats.org/officeDocument/2006/math" xmlns:v="urn:schemas-microsoft-com:vml" xmlns:wp14="http://schemas.microsoft.com/office/word/2010/wordprocessingDrawing" xmlns:wp="http://schemas.openxmlformats.org/drawingml/2006/wordprocessingDrawing" xmlns:w10="urn:schemas-microsoft-com:office:word" xmlns:w="http://schemas.openxmlformats.org/wordprocessingml/2006/main" xmlns:w14="http://schemas.microsoft.com/office/word/2010/wordml" xmlns:w15="http://schemas.microsoft.com/office/word/2012/wordml" xmlns:w16cex="http://schemas.microsoft.com/office/word/2018/wordml/cex" xmlns:w16cid="http://schemas.microsoft.com/office/word/2016/wordml/cid" xmlns:w16="http://schemas.microsoft.com/office/word/2018/wordml" xmlns:w16du="http://schemas.microsoft.com/office/word/2023/wordml/word16du" xmlns:w16sdtdh="http://schemas.microsoft.com/office/word/2020/wordml/sdtdatahash" xmlns:w16sdtfl="http://schemas.microsoft.com/office/word/2024/wordml/sdtformatlock" xmlns:w16se="http://schemas.microsoft.com/office/word/2015/wordml/symex" xmlns:wpg="http://schemas.microsoft.com/office/word/2010/wordprocessingGroup" xmlns:wpi="http://schemas.microsoft.com/office/word/2010/wordprocessingInk" xmlns:wne="http://schemas.microsoft.com/office/word/2006/wordml" xmlns:wps="http://schemas.microsoft.com/office/word/2010/wordprocessingShape" mc:Ignorable="w14 w15 w16se w16cid w16 w16cex w16sdtdh w16sdtfl w16du wp14">
+  <w:p>
+    <w:pPr>
+      <w:pStyle w:val="Footer"/>
+    </w:pPr>
+  </w:p>
+</w:ftr>
+</file>
+
+<file path=word/footnotes.xml><?xml version="1.0" encoding="utf-8"?>
+<w:footnotes xmlns:wpc="http://schemas.microsoft.com/office/word/2010/wordprocessingCanvas" xmlns:cx="http://schemas.microsoft.com/office/drawing/2014/chartex" xmlns:cx1="http://schemas.microsoft.com/office/drawing/2015/9/8/chartex" xmlns:cx2="http://schemas.microsoft.com/office/drawing/2015/10/21/chartex" xmlns:cx3="http://schemas.microsoft.com/office/drawing/2016/5/9/chartex" xmlns:cx4="http://schemas.microsoft.com/office/drawing/2016/5/10/chartex" xmlns:cx5="http://schemas.microsoft.com/office/drawing/2016/5/11/chartex" xmlns:cx6="http://schemas.microsoft.com/office/drawing/2016/5/12/chartex" xmlns:cx7="http://schemas.microsoft.com/office/drawing/2016/5/13/chartex" xmlns:cx8="http://schemas.microsoft.com/office/drawing/2016/5/14/chartex" xmlns:mc="http://schemas.openxmlformats.org/markup-compatibility/2006" xmlns:aink="http://schemas.microsoft.com/office/drawing/2016/ink" xmlns:am3d="http://schemas.microsoft.com/office/drawing/2017/model3d" xmlns:o="urn:schemas-microsoft-com:office:office" xmlns:oel="http://schemas.microsoft.com/office/2019/extlst" xmlns:r="http://schemas.openxmlformats.org/officeDocument/2006/relationships" xmlns:m="http://schemas.openxmlformats.org/officeDocument/2006/math" xmlns:v="urn:schemas-microsoft-com:vml" xmlns:wp14="http://schemas.microsoft.com/office/word/2010/wordprocessingDrawing" xmlns:wp="http://schemas.openxmlformats.org/drawingml/2006/wordprocessingDrawing" xmlns:w10="urn:schemas-microsoft-com:office:word" xmlns:w="http://schemas.openxmlformats.org/wordprocessingml/2006/main" xmlns:w14="http://schemas.microsoft.com/office/word/2010/wordml" xmlns:w15="http://schemas.microsoft.com/office/word/2012/wordml" xmlns:w16cex="http://schemas.microsoft.com/office/word/2018/wordml/cex" xmlns:w16cid="http://schemas.microsoft.com/office/word/2016/wordml/cid" xmlns:w16="http://schemas.microsoft.com/office/word/2018/wordml" xmlns:w16du="http://schemas.microsoft.com/office/word/2023/wordml/word16du" xmlns:w16sdtdh="http://schemas.microsoft.com/office/word/2020/wordml/sdtdatahash" xmlns:w16sdtfl="http://schemas.microsoft.com/office/word/2024/wordml/sdtformatlock" xmlns:w16se="http://schemas.microsoft.com/office/word/2015/wordml/symex" xmlns:wpg="http://schemas.microsoft.com/office/word/2010/wordprocessingGroup" xmlns:wpi="http://schemas.microsoft.com/office/word/2010/wordprocessingInk" xmlns:wne="http://schemas.microsoft.com/office/word/2006/wordml" xmlns:wps="http://schemas.microsoft.com/office/word/2010/wordprocessingShape" mc:Ignorable="w14 w15 w16se w16cid w16 w16cex w16sdtdh w16sdtfl w16du wp14">
+  <w:footnote w:type="separator" w:id="-1">
+    <w:p>
+      <w:pPr>
+        <w:spacing w:after="0" w:line="240" w:lineRule="auto"/>
+      </w:pPr>
+      <w:r>
+        <w:separator/>
+      </w:r>
+    </w:p>
+  </w:footnote>
+  <w:footnote w:type="continuationSeparator" w:id="0">
+    <w:p>
+      <w:pPr>
+        <w:spacing w:after="0" w:line="240" w:lineRule="auto"/>
+      </w:pPr>
+      <w:r>
+        <w:continuationSeparator/>
+      </w:r>
+    </w:p>
+  </w:footnote>
+</w:footnotes>
+</file>
+
 <file path=word/header1.xml><?xml version="1.0" encoding="utf-8"?>
-<w:hdr xmlns:m="http://schemas.openxmlformats.org/officeDocument/2006/math" xmlns:mc="http://schemas.openxmlformats.org/markup-compatibility/2006" xmlns:mo="http://schemas.microsoft.com/office/mac/office/2008/main" xmlns:mv="urn:schemas-microsoft-com:mac:vml" xmlns:o="urn:schemas-microsoft-com:office:office" xmlns:r="http://schemas.openxmlformats.org/officeDocument/2006/relationships" xmlns:v="urn:schemas-microsoft-com:vml" xmlns:w10="urn:schemas-microsoft-com:office:word" xmlns:w14="http://schemas.microsoft.com/office/word/2010/wordml" xmlns:w="http://schemas.openxmlformats.org/wordprocessingml/2006/main" xmlns:wne="http://schemas.microsoft.com/office/word/2006/wordml" xmlns:wp14="http://schemas.microsoft.com/office/word/2010/wordprocessingDrawing" xmlns:wp="http://schemas.openxmlformats.org/drawingml/2006/wordprocessingDrawing" xmlns:wpc="http://schemas.microsoft.com/office/word/2010/wordprocessingCanvas" xmlns:wpg="http://schemas.microsoft.com/office/word/2010/wordprocessingGroup" xmlns:wpi="http://schemas.microsoft.com/office/word/2010/wordprocessingInk" xmlns:wps="http://schemas.microsoft.com/office/word/2010/wordprocessingShape" mc:Ignorable="w14 wp14">
+<w:hdr xmlns:wpc="http://schemas.microsoft.com/office/word/2010/wordprocessingCanvas" xmlns:cx="http://schemas.microsoft.com/office/drawing/2014/chartex" xmlns:cx1="http://schemas.microsoft.com/office/drawing/2015/9/8/chartex" xmlns:cx2="http://schemas.microsoft.com/office/drawing/2015/10/21/chartex" xmlns:cx3="http://schemas.microsoft.com/office/drawing/2016/5/9/chartex" xmlns:cx4="http://schemas.microsoft.com/office/drawing/2016/5/10/chartex" xmlns:cx5="http://schemas.microsoft.com/office/drawing/2016/5/11/chartex" xmlns:cx6="http://schemas.microsoft.com/office/drawing/2016/5/12/chartex" xmlns:cx7="http://schemas.microsoft.com/office/drawing/2016/5/13/chartex" xmlns:cx8="http://schemas.microsoft.com/office/drawing/2016/5/14/chartex" xmlns:mc="http://schemas.openxmlformats.org/markup-compatibility/2006" xmlns:aink="http://schemas.microsoft.com/office/drawing/2016/ink" xmlns:am3d="http://schemas.microsoft.com/office/drawing/2017/model3d" xmlns:o="urn:schemas-microsoft-com:office:office" xmlns:oel="http://schemas.microsoft.com/office/2019/extlst" xmlns:r="http://schemas.openxmlformats.org/officeDocument/2006/relationships" xmlns:m="http://schemas.openxmlformats.org/officeDocument/2006/math" xmlns:v="urn:schemas-microsoft-com:vml" xmlns:wp14="http://schemas.microsoft.com/office/word/2010/wordprocessingDrawing" xmlns:wp="http://schemas.openxmlformats.org/drawingml/2006/wordprocessingDrawing" xmlns:w10="urn:schemas-microsoft-com:office:word" xmlns:w="http://schemas.openxmlformats.org/wordprocessingml/2006/main" xmlns:w14="http://schemas.microsoft.com/office/word/2010/wordml" xmlns:w15="http://schemas.microsoft.com/office/word/2012/wordml" xmlns:w16cex="http://schemas.microsoft.com/office/word/2018/wordml/cex" xmlns:w16cid="http://schemas.microsoft.com/office/word/2016/wordml/cid" xmlns:w16="http://schemas.microsoft.com/office/word/2018/wordml" xmlns:w16du="http://schemas.microsoft.com/office/word/2023/wordml/word16du" xmlns:w16sdtdh="http://schemas.microsoft.com/office/word/2020/wordml/sdtdatahash" xmlns:w16sdtfl="http://schemas.microsoft.com/office/word/2024/wordml/sdtformatlock" xmlns:w16se="http://schemas.microsoft.com/office/word/2015/wordml/symex" xmlns:wpg="http://schemas.microsoft.com/office/word/2010/wordprocessingGroup" xmlns:wpi="http://schemas.microsoft.com/office/word/2010/wordprocessingInk" xmlns:wne="http://schemas.microsoft.com/office/word/2006/wordml" xmlns:wps="http://schemas.microsoft.com/office/word/2010/wordprocessingShape" mc:Ignorable="w14 w15 w16se w16cid w16 w16cex w16sdtdh w16sdtfl w16du wp14">
   <w:p>
     <w:pPr>
       <w:pStyle w:val="Header"/>
-      <w:tabs>
-        <w:tab w:pos="9820" w:val="right"/>
-      </w:tabs>
-      <w:spacing w:before="0" w:after="0" w:lineRule="exact" w:line="480"/>
-      <w:shd w:val="clear" w:fill="002855"/>
+    </w:pPr>
+  </w:p>
+</w:hdr>
+</file>
+
+<file path=word/header2.xml><?xml version="1.0" encoding="utf-8"?>
+<w:hdr xmlns:wpc="http://schemas.microsoft.com/office/word/2010/wordprocessingCanvas" xmlns:cx="http://schemas.microsoft.com/office/drawing/2014/chartex" xmlns:cx1="http://schemas.microsoft.com/office/drawing/2015/9/8/chartex" xmlns:cx2="http://schemas.microsoft.com/office/drawing/2015/10/21/chartex" xmlns:cx3="http://schemas.microsoft.com/office/drawing/2016/5/9/chartex" xmlns:cx4="http://schemas.microsoft.com/office/drawing/2016/5/10/chartex" xmlns:cx5="http://schemas.microsoft.com/office/drawing/2016/5/11/chartex" xmlns:cx6="http://schemas.microsoft.com/office/drawing/2016/5/12/chartex" xmlns:cx7="http://schemas.microsoft.com/office/drawing/2016/5/13/chartex" xmlns:cx8="http://schemas.microsoft.com/office/drawing/2016/5/14/chartex" xmlns:mc="http://schemas.openxmlformats.org/markup-compatibility/2006" xmlns:aink="http://schemas.microsoft.com/office/drawing/2016/ink" xmlns:am3d="http://schemas.microsoft.com/office/drawing/2017/model3d" xmlns:o="urn:schemas-microsoft-com:office:office" xmlns:oel="http://schemas.microsoft.com/office/2019/extlst" xmlns:r="http://schemas.openxmlformats.org/officeDocument/2006/relationships" xmlns:m="http://schemas.openxmlformats.org/officeDocument/2006/math" xmlns:v="urn:schemas-microsoft-com:vml" xmlns:wp14="http://schemas.microsoft.com/office/word/2010/wordprocessingDrawing" xmlns:wp="http://schemas.openxmlformats.org/drawingml/2006/wordprocessingDrawing" xmlns:w10="urn:schemas-microsoft-com:office:word" xmlns:w="http://schemas.openxmlformats.org/wordprocessingml/2006/main" xmlns:w14="http://schemas.microsoft.com/office/word/2010/wordml" xmlns:w15="http://schemas.microsoft.com/office/word/2012/wordml" xmlns:w16cex="http://schemas.microsoft.com/office/word/2018/wordml/cex" xmlns:w16cid="http://schemas.microsoft.com/office/word/2016/wordml/cid" xmlns:w16="http://schemas.microsoft.com/office/word/2018/wordml" xmlns:w16du="http://schemas.microsoft.com/office/word/2023/wordml/word16du" xmlns:w16sdtdh="http://schemas.microsoft.com/office/word/2020/wordml/sdtdatahash" xmlns:w16sdtfl="http://schemas.microsoft.com/office/word/2024/wordml/sdtformatlock" xmlns:w16se="http://schemas.microsoft.com/office/word/2015/wordml/symex" xmlns:wpg="http://schemas.microsoft.com/office/word/2010/wordprocessingGroup" xmlns:wpi="http://schemas.microsoft.com/office/word/2010/wordprocessingInk" xmlns:wne="http://schemas.microsoft.com/office/word/2006/wordml" xmlns:wps="http://schemas.microsoft.com/office/word/2010/wordprocessingShape" mc:Ignorable="w14 w15 w16se w16cid w16 w16cex w16sdtdh w16sdtfl w16du wp14">
+  <w:p>
+    <w:pPr>
+      <w:pStyle w:val="Header"/>
       <w:pBdr>
         <w:bottom w:val="single" w:sz="16" w:space="0" w:color="EEAA00"/>
       </w:pBdr>
+      <w:shd w:val="clear" w:color="auto" w:fill="002855"/>
+      <w:tabs>
+        <w:tab w:val="right" w:pos="9821"/>
+      </w:tabs>
+      <w:spacing w:line="600" w:lineRule="exact"/>
     </w:pPr>
     <w:r>
       <w:rPr>
-        <w:rFonts w:ascii="Arial" w:hAnsi="Arial"/>
         <w:b/>
         <w:color w:val="FFFFFF"/>
         <w:sz w:val="32"/>
@@ -608,8 +414,6 @@
     </w:r>
     <w:r>
       <w:rPr>
-        <w:rFonts w:ascii="Arial" w:hAnsi="Arial"/>
-        <w:b w:val="0"/>
         <w:color w:val="FFFFFF"/>
         <w:sz w:val="18"/>
       </w:rPr>
@@ -620,18 +424,147 @@
 </w:hdr>
 </file>
 
+<file path=word/header3.xml><?xml version="1.0" encoding="utf-8"?>
+<w:hdr xmlns:wpc="http://schemas.microsoft.com/office/word/2010/wordprocessingCanvas" xmlns:cx="http://schemas.microsoft.com/office/drawing/2014/chartex" xmlns:cx1="http://schemas.microsoft.com/office/drawing/2015/9/8/chartex" xmlns:cx2="http://schemas.microsoft.com/office/drawing/2015/10/21/chartex" xmlns:cx3="http://schemas.microsoft.com/office/drawing/2016/5/9/chartex" xmlns:cx4="http://schemas.microsoft.com/office/drawing/2016/5/10/chartex" xmlns:cx5="http://schemas.microsoft.com/office/drawing/2016/5/11/chartex" xmlns:cx6="http://schemas.microsoft.com/office/drawing/2016/5/12/chartex" xmlns:cx7="http://schemas.microsoft.com/office/drawing/2016/5/13/chartex" xmlns:cx8="http://schemas.microsoft.com/office/drawing/2016/5/14/chartex" xmlns:mc="http://schemas.openxmlformats.org/markup-compatibility/2006" xmlns:aink="http://schemas.microsoft.com/office/drawing/2016/ink" xmlns:am3d="http://schemas.microsoft.com/office/drawing/2017/model3d" xmlns:o="urn:schemas-microsoft-com:office:office" xmlns:oel="http://schemas.microsoft.com/office/2019/extlst" xmlns:r="http://schemas.openxmlformats.org/officeDocument/2006/relationships" xmlns:m="http://schemas.openxmlformats.org/officeDocument/2006/math" xmlns:v="urn:schemas-microsoft-com:vml" xmlns:wp14="http://schemas.microsoft.com/office/word/2010/wordprocessingDrawing" xmlns:wp="http://schemas.openxmlformats.org/drawingml/2006/wordprocessingDrawing" xmlns:w10="urn:schemas-microsoft-com:office:word" xmlns:w="http://schemas.openxmlformats.org/wordprocessingml/2006/main" xmlns:w14="http://schemas.microsoft.com/office/word/2010/wordml" xmlns:w15="http://schemas.microsoft.com/office/word/2012/wordml" xmlns:w16cex="http://schemas.microsoft.com/office/word/2018/wordml/cex" xmlns:w16cid="http://schemas.microsoft.com/office/word/2016/wordml/cid" xmlns:w16="http://schemas.microsoft.com/office/word/2018/wordml" xmlns:w16du="http://schemas.microsoft.com/office/word/2023/wordml/word16du" xmlns:w16sdtdh="http://schemas.microsoft.com/office/word/2020/wordml/sdtdatahash" xmlns:w16sdtfl="http://schemas.microsoft.com/office/word/2024/wordml/sdtformatlock" xmlns:w16se="http://schemas.microsoft.com/office/word/2015/wordml/symex" xmlns:wpg="http://schemas.microsoft.com/office/word/2010/wordprocessingGroup" xmlns:wpi="http://schemas.microsoft.com/office/word/2010/wordprocessingInk" xmlns:wne="http://schemas.microsoft.com/office/word/2006/wordml" xmlns:wps="http://schemas.microsoft.com/office/word/2010/wordprocessingShape" mc:Ignorable="w14 w15 w16se w16cid w16 w16cex w16sdtdh w16sdtfl w16du wp14">
+  <w:p>
+    <w:pPr>
+      <w:pStyle w:val="Header"/>
+    </w:pPr>
+  </w:p>
+</w:hdr>
+</file>
+
 <file path=word/numbering.xml><?xml version="1.0" encoding="utf-8"?>
-<w:numbering xmlns:mc="http://schemas.openxmlformats.org/markup-compatibility/2006" xmlns:o="urn:schemas-microsoft-com:office:office" xmlns:r="http://schemas.openxmlformats.org/officeDocument/2006/relationships" xmlns:m="http://schemas.openxmlformats.org/officeDocument/2006/math" xmlns:v="urn:schemas-microsoft-com:vml" xmlns:wp="http://schemas.openxmlformats.org/drawingml/2006/wordprocessingDrawing" xmlns:w10="urn:schemas-microsoft-com:office:word" xmlns:w="http://schemas.openxmlformats.org/wordprocessingml/2006/main" xmlns:wne="http://schemas.microsoft.com/office/word/2006/wordml" xmlns:sl="http://schemas.openxmlformats.org/schemaLibrary/2006/main" xmlns:a="http://schemas.openxmlformats.org/drawingml/2006/main" xmlns:pic="http://schemas.openxmlformats.org/drawingml/2006/picture" xmlns:c="http://schemas.openxmlformats.org/drawingml/2006/chart" xmlns:lc="http://schemas.openxmlformats.org/drawingml/2006/lockedCanvas" xmlns:dgm="http://schemas.openxmlformats.org/drawingml/2006/diagram" xmlns:wps="http://schemas.microsoft.com/office/word/2010/wordprocessingShape" xmlns:wpg="http://schemas.microsoft.com/office/word/2010/wordprocessingGroup" xmlns:w14="http://schemas.microsoft.com/office/word/2010/wordml" xmlns:w15="http://schemas.microsoft.com/office/word/2012/wordml" xmlns:w16="http://schemas.microsoft.com/office/word/2018/wordml" xmlns:w16cex="http://schemas.microsoft.com/office/word/2018/wordml/cex" xmlns:w16cid="http://schemas.microsoft.com/office/word/2016/wordml/cid" xmlns="http://schemas.microsoft.com/office/tasks/2019/documenttasks" xmlns:cr="http://schemas.microsoft.com/office/comments/2020/reactions">
-  <w:abstractNum w:abstractNumId="1">
+<w:numbering xmlns:wpc="http://schemas.microsoft.com/office/word/2010/wordprocessingCanvas" xmlns:cx="http://schemas.microsoft.com/office/drawing/2014/chartex" xmlns:cx1="http://schemas.microsoft.com/office/drawing/2015/9/8/chartex" xmlns:cx2="http://schemas.microsoft.com/office/drawing/2015/10/21/chartex" xmlns:cx3="http://schemas.microsoft.com/office/drawing/2016/5/9/chartex" xmlns:cx4="http://schemas.microsoft.com/office/drawing/2016/5/10/chartex" xmlns:cx5="http://schemas.microsoft.com/office/drawing/2016/5/11/chartex" xmlns:cx6="http://schemas.microsoft.com/office/drawing/2016/5/12/chartex" xmlns:cx7="http://schemas.microsoft.com/office/drawing/2016/5/13/chartex" xmlns:cx8="http://schemas.microsoft.com/office/drawing/2016/5/14/chartex" xmlns:mc="http://schemas.openxmlformats.org/markup-compatibility/2006" xmlns:aink="http://schemas.microsoft.com/office/drawing/2016/ink" xmlns:am3d="http://schemas.microsoft.com/office/drawing/2017/model3d" xmlns:o="urn:schemas-microsoft-com:office:office" xmlns:oel="http://schemas.microsoft.com/office/2019/extlst" xmlns:r="http://schemas.openxmlformats.org/officeDocument/2006/relationships" xmlns:m="http://schemas.openxmlformats.org/officeDocument/2006/math" xmlns:v="urn:schemas-microsoft-com:vml" xmlns:wp14="http://schemas.microsoft.com/office/word/2010/wordprocessingDrawing" xmlns:wp="http://schemas.openxmlformats.org/drawingml/2006/wordprocessingDrawing" xmlns:w10="urn:schemas-microsoft-com:office:word" xmlns:w="http://schemas.openxmlformats.org/wordprocessingml/2006/main" xmlns:w14="http://schemas.microsoft.com/office/word/2010/wordml" xmlns:w15="http://schemas.microsoft.com/office/word/2012/wordml" xmlns:w16cex="http://schemas.microsoft.com/office/word/2018/wordml/cex" xmlns:w16cid="http://schemas.microsoft.com/office/word/2016/wordml/cid" xmlns:w16="http://schemas.microsoft.com/office/word/2018/wordml" xmlns:w16du="http://schemas.microsoft.com/office/word/2023/wordml/word16du" xmlns:w16sdtdh="http://schemas.microsoft.com/office/word/2020/wordml/sdtdatahash" xmlns:w16sdtfl="http://schemas.microsoft.com/office/word/2024/wordml/sdtformatlock" xmlns:w16se="http://schemas.microsoft.com/office/word/2015/wordml/symex" xmlns:wpg="http://schemas.microsoft.com/office/word/2010/wordprocessingGroup" xmlns:wpi="http://schemas.microsoft.com/office/word/2010/wordprocessingInk" xmlns:wne="http://schemas.microsoft.com/office/word/2006/wordml" xmlns:wps="http://schemas.microsoft.com/office/word/2010/wordprocessingShape" mc:Ignorable="w14 w15 w16se w16cid w16 w16cex w16sdtdh w16sdtfl w16du wp14">
+  <w:abstractNum w:abstractNumId="0" w15:restartNumberingAfterBreak="0">
+    <w:nsid w:val="187273EE"/>
+    <w:multiLevelType w:val="multilevel"/>
+    <w:tmpl w:val="928694B6"/>
     <w:lvl w:ilvl="0">
       <w:start w:val="1"/>
       <w:numFmt w:val="decimal"/>
+      <w:pStyle w:val="ListNumber"/>
+      <w:lvlText w:val="%1."/>
+      <w:lvlJc w:val="left"/>
+      <w:pPr>
+        <w:tabs>
+          <w:tab w:val="num" w:pos="720"/>
+        </w:tabs>
+        <w:ind w:left="720" w:hanging="720"/>
+      </w:pPr>
+    </w:lvl>
+    <w:lvl w:ilvl="1">
+      <w:start w:val="1"/>
+      <w:numFmt w:val="decimal"/>
+      <w:lvlText w:val="%2."/>
+      <w:lvlJc w:val="left"/>
+      <w:pPr>
+        <w:tabs>
+          <w:tab w:val="num" w:pos="1440"/>
+        </w:tabs>
+        <w:ind w:left="1440" w:hanging="720"/>
+      </w:pPr>
+    </w:lvl>
+    <w:lvl w:ilvl="2">
+      <w:start w:val="1"/>
+      <w:numFmt w:val="decimal"/>
+      <w:lvlText w:val="%3."/>
+      <w:lvlJc w:val="left"/>
+      <w:pPr>
+        <w:tabs>
+          <w:tab w:val="num" w:pos="2160"/>
+        </w:tabs>
+        <w:ind w:left="2160" w:hanging="720"/>
+      </w:pPr>
+    </w:lvl>
+    <w:lvl w:ilvl="3">
+      <w:start w:val="1"/>
+      <w:numFmt w:val="decimal"/>
+      <w:lvlText w:val="%4."/>
+      <w:lvlJc w:val="left"/>
+      <w:pPr>
+        <w:tabs>
+          <w:tab w:val="num" w:pos="2880"/>
+        </w:tabs>
+        <w:ind w:left="2880" w:hanging="720"/>
+      </w:pPr>
+    </w:lvl>
+    <w:lvl w:ilvl="4">
+      <w:start w:val="1"/>
+      <w:numFmt w:val="decimal"/>
+      <w:lvlText w:val="%5."/>
+      <w:lvlJc w:val="left"/>
+      <w:pPr>
+        <w:tabs>
+          <w:tab w:val="num" w:pos="3600"/>
+        </w:tabs>
+        <w:ind w:left="3600" w:hanging="720"/>
+      </w:pPr>
+    </w:lvl>
+    <w:lvl w:ilvl="5">
+      <w:start w:val="1"/>
+      <w:numFmt w:val="decimal"/>
+      <w:lvlText w:val="%6."/>
+      <w:lvlJc w:val="left"/>
+      <w:pPr>
+        <w:tabs>
+          <w:tab w:val="num" w:pos="4320"/>
+        </w:tabs>
+        <w:ind w:left="4320" w:hanging="720"/>
+      </w:pPr>
+    </w:lvl>
+    <w:lvl w:ilvl="6">
+      <w:start w:val="1"/>
+      <w:numFmt w:val="decimal"/>
+      <w:lvlText w:val="%7."/>
+      <w:lvlJc w:val="left"/>
+      <w:pPr>
+        <w:tabs>
+          <w:tab w:val="num" w:pos="5040"/>
+        </w:tabs>
+        <w:ind w:left="5040" w:hanging="720"/>
+      </w:pPr>
+    </w:lvl>
+    <w:lvl w:ilvl="7">
+      <w:start w:val="1"/>
+      <w:numFmt w:val="decimal"/>
+      <w:lvlText w:val="%8."/>
+      <w:lvlJc w:val="left"/>
+      <w:pPr>
+        <w:tabs>
+          <w:tab w:val="num" w:pos="5760"/>
+        </w:tabs>
+        <w:ind w:left="5760" w:hanging="720"/>
+      </w:pPr>
+    </w:lvl>
+    <w:lvl w:ilvl="8">
+      <w:start w:val="1"/>
+      <w:numFmt w:val="decimal"/>
+      <w:lvlText w:val="%9."/>
+      <w:lvlJc w:val="left"/>
+      <w:pPr>
+        <w:tabs>
+          <w:tab w:val="num" w:pos="6480"/>
+        </w:tabs>
+        <w:ind w:left="6480" w:hanging="720"/>
+      </w:pPr>
+    </w:lvl>
+  </w:abstractNum>
+  <w:abstractNum w:abstractNumId="1" w15:restartNumberingAfterBreak="0">
+    <w:nsid w:val="1AD46017"/>
+    <w:multiLevelType w:val="multilevel"/>
+    <w:tmpl w:val="1804940C"/>
+    <w:lvl w:ilvl="0">
+      <w:start w:val="1"/>
+      <w:numFmt w:val="decimal"/>
+      <w:pStyle w:val="ListBullet"/>
       <w:lvlText w:val="%1)"/>
       <w:lvlJc w:val="left"/>
       <w:pPr>
         <w:ind w:left="720" w:hanging="360"/>
       </w:pPr>
       <w:rPr>
+        <w:rFonts w:ascii="Arial" w:eastAsia="Arial" w:hAnsi="Arial" w:cs="Arial"/>
         <w:u w:val="none"/>
       </w:rPr>
     </w:lvl>
@@ -644,6 +577,7 @@
         <w:ind w:left="1440" w:hanging="360"/>
       </w:pPr>
       <w:rPr>
+        <w:rFonts w:ascii="Arial" w:eastAsia="Arial" w:hAnsi="Arial" w:cs="Arial"/>
         <w:u w:val="none"/>
       </w:rPr>
     </w:lvl>
@@ -656,6 +590,7 @@
         <w:ind w:left="2160" w:hanging="360"/>
       </w:pPr>
       <w:rPr>
+        <w:rFonts w:ascii="Arial" w:eastAsia="Arial" w:hAnsi="Arial" w:cs="Arial"/>
         <w:u w:val="none"/>
       </w:rPr>
     </w:lvl>
@@ -668,6 +603,7 @@
         <w:ind w:left="2880" w:hanging="360"/>
       </w:pPr>
       <w:rPr>
+        <w:rFonts w:ascii="Arial" w:eastAsia="Arial" w:hAnsi="Arial" w:cs="Arial"/>
         <w:u w:val="none"/>
       </w:rPr>
     </w:lvl>
@@ -680,6 +616,7 @@
         <w:ind w:left="3600" w:hanging="360"/>
       </w:pPr>
       <w:rPr>
+        <w:rFonts w:ascii="Arial" w:eastAsia="Arial" w:hAnsi="Arial" w:cs="Arial"/>
         <w:u w:val="none"/>
       </w:rPr>
     </w:lvl>
@@ -692,6 +629,7 @@
         <w:ind w:left="4320" w:hanging="360"/>
       </w:pPr>
       <w:rPr>
+        <w:rFonts w:ascii="Arial" w:eastAsia="Arial" w:hAnsi="Arial" w:cs="Arial"/>
         <w:u w:val="none"/>
       </w:rPr>
     </w:lvl>
@@ -704,6 +642,7 @@
         <w:ind w:left="5040" w:hanging="360"/>
       </w:pPr>
       <w:rPr>
+        <w:rFonts w:ascii="Arial" w:eastAsia="Arial" w:hAnsi="Arial" w:cs="Arial"/>
         <w:u w:val="none"/>
       </w:rPr>
     </w:lvl>
@@ -716,6 +655,7 @@
         <w:ind w:left="5760" w:hanging="360"/>
       </w:pPr>
       <w:rPr>
+        <w:rFonts w:ascii="Arial" w:eastAsia="Arial" w:hAnsi="Arial" w:cs="Arial"/>
         <w:u w:val="none"/>
       </w:rPr>
     </w:lvl>
@@ -728,11 +668,15 @@
         <w:ind w:left="6480" w:hanging="360"/>
       </w:pPr>
       <w:rPr>
+        <w:rFonts w:ascii="Arial" w:eastAsia="Arial" w:hAnsi="Arial" w:cs="Arial"/>
         <w:u w:val="none"/>
       </w:rPr>
     </w:lvl>
   </w:abstractNum>
-  <w:abstractNum w:abstractNumId="2">
+  <w:abstractNum w:abstractNumId="2" w15:restartNumberingAfterBreak="0">
+    <w:nsid w:val="65677641"/>
+    <w:multiLevelType w:val="multilevel"/>
+    <w:tmpl w:val="00EA5D4E"/>
     <w:lvl w:ilvl="0">
       <w:start w:val="1"/>
       <w:numFmt w:val="bullet"/>
@@ -742,6 +686,7 @@
         <w:ind w:left="720" w:hanging="360"/>
       </w:pPr>
       <w:rPr>
+        <w:rFonts w:ascii="Arial" w:eastAsia="Arial" w:hAnsi="Arial" w:cs="Arial"/>
         <w:u w:val="none"/>
       </w:rPr>
     </w:lvl>
@@ -754,6 +699,7 @@
         <w:ind w:left="1440" w:hanging="360"/>
       </w:pPr>
       <w:rPr>
+        <w:rFonts w:ascii="Arial" w:eastAsia="Arial" w:hAnsi="Arial" w:cs="Arial"/>
         <w:u w:val="none"/>
       </w:rPr>
     </w:lvl>
@@ -766,6 +712,7 @@
         <w:ind w:left="2160" w:hanging="360"/>
       </w:pPr>
       <w:rPr>
+        <w:rFonts w:ascii="Arial" w:eastAsia="Arial" w:hAnsi="Arial" w:cs="Arial"/>
         <w:u w:val="none"/>
       </w:rPr>
     </w:lvl>
@@ -778,6 +725,7 @@
         <w:ind w:left="2880" w:hanging="360"/>
       </w:pPr>
       <w:rPr>
+        <w:rFonts w:ascii="Arial" w:eastAsia="Arial" w:hAnsi="Arial" w:cs="Arial"/>
         <w:u w:val="none"/>
       </w:rPr>
     </w:lvl>
@@ -790,6 +738,7 @@
         <w:ind w:left="3600" w:hanging="360"/>
       </w:pPr>
       <w:rPr>
+        <w:rFonts w:ascii="Arial" w:eastAsia="Arial" w:hAnsi="Arial" w:cs="Arial"/>
         <w:u w:val="none"/>
       </w:rPr>
     </w:lvl>
@@ -802,6 +751,7 @@
         <w:ind w:left="4320" w:hanging="360"/>
       </w:pPr>
       <w:rPr>
+        <w:rFonts w:ascii="Arial" w:eastAsia="Arial" w:hAnsi="Arial" w:cs="Arial"/>
         <w:u w:val="none"/>
       </w:rPr>
     </w:lvl>
@@ -814,6 +764,7 @@
         <w:ind w:left="5040" w:hanging="360"/>
       </w:pPr>
       <w:rPr>
+        <w:rFonts w:ascii="Arial" w:eastAsia="Arial" w:hAnsi="Arial" w:cs="Arial"/>
         <w:u w:val="none"/>
       </w:rPr>
     </w:lvl>
@@ -826,6 +777,7 @@
         <w:ind w:left="5760" w:hanging="360"/>
       </w:pPr>
       <w:rPr>
+        <w:rFonts w:ascii="Arial" w:eastAsia="Arial" w:hAnsi="Arial" w:cs="Arial"/>
         <w:u w:val="none"/>
       </w:rPr>
     </w:lvl>
@@ -838,11 +790,15 @@
         <w:ind w:left="6480" w:hanging="360"/>
       </w:pPr>
       <w:rPr>
+        <w:rFonts w:ascii="Arial" w:eastAsia="Arial" w:hAnsi="Arial" w:cs="Arial"/>
         <w:u w:val="none"/>
       </w:rPr>
     </w:lvl>
   </w:abstractNum>
-  <w:abstractNum w:abstractNumId="3">
+  <w:abstractNum w:abstractNumId="3" w15:restartNumberingAfterBreak="0">
+    <w:nsid w:val="6C5A799E"/>
+    <w:multiLevelType w:val="multilevel"/>
+    <w:tmpl w:val="0A944790"/>
     <w:lvl w:ilvl="0">
       <w:start w:val="1"/>
       <w:numFmt w:val="bullet"/>
@@ -852,6 +808,7 @@
         <w:ind w:left="720" w:hanging="360"/>
       </w:pPr>
       <w:rPr>
+        <w:rFonts w:ascii="Arial" w:eastAsia="Arial" w:hAnsi="Arial" w:cs="Arial"/>
         <w:u w:val="none"/>
       </w:rPr>
     </w:lvl>
@@ -864,6 +821,7 @@
         <w:ind w:left="1440" w:hanging="360"/>
       </w:pPr>
       <w:rPr>
+        <w:rFonts w:ascii="Arial" w:eastAsia="Arial" w:hAnsi="Arial" w:cs="Arial"/>
         <w:u w:val="none"/>
       </w:rPr>
     </w:lvl>
@@ -876,6 +834,7 @@
         <w:ind w:left="2160" w:hanging="360"/>
       </w:pPr>
       <w:rPr>
+        <w:rFonts w:ascii="Arial" w:eastAsia="Arial" w:hAnsi="Arial" w:cs="Arial"/>
         <w:u w:val="none"/>
       </w:rPr>
     </w:lvl>
@@ -888,6 +847,7 @@
         <w:ind w:left="2880" w:hanging="360"/>
       </w:pPr>
       <w:rPr>
+        <w:rFonts w:ascii="Arial" w:eastAsia="Arial" w:hAnsi="Arial" w:cs="Arial"/>
         <w:u w:val="none"/>
       </w:rPr>
     </w:lvl>
@@ -900,6 +860,7 @@
         <w:ind w:left="3600" w:hanging="360"/>
       </w:pPr>
       <w:rPr>
+        <w:rFonts w:ascii="Arial" w:eastAsia="Arial" w:hAnsi="Arial" w:cs="Arial"/>
         <w:u w:val="none"/>
       </w:rPr>
     </w:lvl>
@@ -912,6 +873,7 @@
         <w:ind w:left="4320" w:hanging="360"/>
       </w:pPr>
       <w:rPr>
+        <w:rFonts w:ascii="Arial" w:eastAsia="Arial" w:hAnsi="Arial" w:cs="Arial"/>
         <w:u w:val="none"/>
       </w:rPr>
     </w:lvl>
@@ -924,6 +886,7 @@
         <w:ind w:left="5040" w:hanging="360"/>
       </w:pPr>
       <w:rPr>
+        <w:rFonts w:ascii="Arial" w:eastAsia="Arial" w:hAnsi="Arial" w:cs="Arial"/>
         <w:u w:val="none"/>
       </w:rPr>
     </w:lvl>
@@ -936,6 +899,7 @@
         <w:ind w:left="5760" w:hanging="360"/>
       </w:pPr>
       <w:rPr>
+        <w:rFonts w:ascii="Arial" w:eastAsia="Arial" w:hAnsi="Arial" w:cs="Arial"/>
         <w:u w:val="none"/>
       </w:rPr>
     </w:lvl>
@@ -948,31 +912,35 @@
         <w:ind w:left="6480" w:hanging="360"/>
       </w:pPr>
       <w:rPr>
+        <w:rFonts w:ascii="Arial" w:eastAsia="Arial" w:hAnsi="Arial" w:cs="Arial"/>
         <w:u w:val="none"/>
       </w:rPr>
     </w:lvl>
   </w:abstractNum>
-  <w:num w:numId="1">
+  <w:num w:numId="1" w16cid:durableId="435948239">
     <w:abstractNumId w:val="1"/>
   </w:num>
-  <w:num w:numId="2">
+  <w:num w:numId="2" w16cid:durableId="1550529686">
     <w:abstractNumId w:val="2"/>
   </w:num>
-  <w:num w:numId="3">
+  <w:num w:numId="3" w16cid:durableId="222453855">
     <w:abstractNumId w:val="3"/>
+  </w:num>
+  <w:num w:numId="4" w16cid:durableId="1098908899">
+    <w:abstractNumId w:val="0"/>
   </w:num>
 </w:numbering>
 </file>
 
 <file path=word/styles.xml><?xml version="1.0" encoding="utf-8"?>
-<w:styles xmlns:mc="http://schemas.openxmlformats.org/markup-compatibility/2006" xmlns:o="urn:schemas-microsoft-com:office:office" xmlns:r="http://schemas.openxmlformats.org/officeDocument/2006/relationships" xmlns:m="http://schemas.openxmlformats.org/officeDocument/2006/math" xmlns:v="urn:schemas-microsoft-com:vml" xmlns:wp="http://schemas.openxmlformats.org/drawingml/2006/wordprocessingDrawing" xmlns:w10="urn:schemas-microsoft-com:office:word" xmlns:w="http://schemas.openxmlformats.org/wordprocessingml/2006/main" xmlns:wne="http://schemas.microsoft.com/office/word/2006/wordml" xmlns:sl="http://schemas.openxmlformats.org/schemaLibrary/2006/main" xmlns:a="http://schemas.openxmlformats.org/drawingml/2006/main" xmlns:pic="http://schemas.openxmlformats.org/drawingml/2006/picture" xmlns:c="http://schemas.openxmlformats.org/drawingml/2006/chart" xmlns:lc="http://schemas.openxmlformats.org/drawingml/2006/lockedCanvas" xmlns:dgm="http://schemas.openxmlformats.org/drawingml/2006/diagram" xmlns:wps="http://schemas.microsoft.com/office/word/2010/wordprocessingShape" xmlns:wpg="http://schemas.microsoft.com/office/word/2010/wordprocessingGroup" xmlns:w14="http://schemas.microsoft.com/office/word/2010/wordml" xmlns:w15="http://schemas.microsoft.com/office/word/2012/wordml" xmlns:w16="http://schemas.microsoft.com/office/word/2018/wordml" xmlns:w16cex="http://schemas.microsoft.com/office/word/2018/wordml/cex" xmlns:w16cid="http://schemas.microsoft.com/office/word/2016/wordml/cid" xmlns="http://schemas.microsoft.com/office/tasks/2019/documenttasks" xmlns:cr="http://schemas.microsoft.com/office/comments/2020/reactions">
+<w:styles xmlns:mc="http://schemas.openxmlformats.org/markup-compatibility/2006" xmlns:r="http://schemas.openxmlformats.org/officeDocument/2006/relationships" xmlns:w="http://schemas.openxmlformats.org/wordprocessingml/2006/main" xmlns:w14="http://schemas.microsoft.com/office/word/2010/wordml" xmlns:w15="http://schemas.microsoft.com/office/word/2012/wordml" xmlns:w16cex="http://schemas.microsoft.com/office/word/2018/wordml/cex" xmlns:w16cid="http://schemas.microsoft.com/office/word/2016/wordml/cid" xmlns:w16="http://schemas.microsoft.com/office/word/2018/wordml" xmlns:w16du="http://schemas.microsoft.com/office/word/2023/wordml/word16du" xmlns:w16sdtdh="http://schemas.microsoft.com/office/word/2020/wordml/sdtdatahash" xmlns:w16sdtfl="http://schemas.microsoft.com/office/word/2024/wordml/sdtformatlock" xmlns:w16se="http://schemas.microsoft.com/office/word/2015/wordml/symex" mc:Ignorable="w14 w15 w16se w16cid w16 w16cex w16sdtdh w16sdtfl w16du">
   <w:docDefaults>
     <w:rPrDefault>
       <w:rPr>
-        <w:rFonts w:ascii="Arial" w:cs="Arial" w:eastAsia="Arial" w:hAnsi="Arial"/>
+        <w:rFonts w:ascii="Arial" w:eastAsia="Arial" w:hAnsi="Arial" w:cs="Arial"/>
         <w:sz w:val="22"/>
         <w:szCs w:val="22"/>
-        <w:lang w:val="en"/>
+        <w:lang w:val="en" w:eastAsia="en-US" w:bidi="ar-SA"/>
       </w:rPr>
     </w:rPrDefault>
     <w:pPrDefault>
@@ -981,97 +949,471 @@
       </w:pPr>
     </w:pPrDefault>
   </w:docDefaults>
-  <w:style w:type="table" w:styleId="TableNormal" w:default="1">
-    <w:name w:val="TableNormal"/>
-    <w:tblPr>
-      <w:tblCellMar>
-        <w:top w:w="100.0" w:type="dxa"/>
-        <w:left w:w="100.0" w:type="dxa"/>
-        <w:bottom w:w="100.0" w:type="dxa"/>
-        <w:right w:w="100.0" w:type="dxa"/>
-      </w:tblCellMar>
-    </w:tblPr>
-  </w:style>
-  <w:style w:type="paragraph" w:styleId="Normal" w:default="1">
-    <w:name w:val="normal"/>
-    <w:pPr>
-      <w:spacing w:after="120" w:line="264" w:lineRule="auto"/>
+  <w:latentStyles w:defLockedState="0" w:defUIPriority="99" w:defSemiHidden="0" w:defUnhideWhenUsed="0" w:defQFormat="0" w:count="376">
+    <w:lsdException w:name="Normal" w:uiPriority="0" w:qFormat="1"/>
+    <w:lsdException w:name="heading 1" w:uiPriority="9" w:qFormat="1"/>
+    <w:lsdException w:name="heading 2" w:semiHidden="1" w:uiPriority="9" w:unhideWhenUsed="1" w:qFormat="1"/>
+    <w:lsdException w:name="heading 3" w:semiHidden="1" w:uiPriority="9" w:unhideWhenUsed="1" w:qFormat="1"/>
+    <w:lsdException w:name="heading 4" w:semiHidden="1" w:uiPriority="9" w:unhideWhenUsed="1" w:qFormat="1"/>
+    <w:lsdException w:name="heading 5" w:semiHidden="1" w:uiPriority="9" w:unhideWhenUsed="1" w:qFormat="1"/>
+    <w:lsdException w:name="heading 6" w:semiHidden="1" w:uiPriority="9" w:unhideWhenUsed="1" w:qFormat="1"/>
+    <w:lsdException w:name="heading 7" w:semiHidden="1" w:uiPriority="9" w:unhideWhenUsed="1" w:qFormat="1"/>
+    <w:lsdException w:name="heading 8" w:semiHidden="1" w:uiPriority="9" w:unhideWhenUsed="1" w:qFormat="1"/>
+    <w:lsdException w:name="heading 9" w:semiHidden="1" w:uiPriority="9" w:unhideWhenUsed="1" w:qFormat="1"/>
+    <w:lsdException w:name="index 1" w:semiHidden="1" w:unhideWhenUsed="1"/>
+    <w:lsdException w:name="index 2" w:semiHidden="1" w:unhideWhenUsed="1"/>
+    <w:lsdException w:name="index 3" w:semiHidden="1" w:unhideWhenUsed="1"/>
+    <w:lsdException w:name="index 4" w:semiHidden="1" w:unhideWhenUsed="1"/>
+    <w:lsdException w:name="index 5" w:semiHidden="1" w:unhideWhenUsed="1"/>
+    <w:lsdException w:name="index 6" w:semiHidden="1" w:unhideWhenUsed="1"/>
+    <w:lsdException w:name="index 7" w:semiHidden="1" w:unhideWhenUsed="1"/>
+    <w:lsdException w:name="index 8" w:semiHidden="1" w:unhideWhenUsed="1"/>
+    <w:lsdException w:name="index 9" w:semiHidden="1" w:unhideWhenUsed="1"/>
+    <w:lsdException w:name="toc 1" w:semiHidden="1" w:uiPriority="39" w:unhideWhenUsed="1"/>
+    <w:lsdException w:name="toc 2" w:semiHidden="1" w:uiPriority="39" w:unhideWhenUsed="1"/>
+    <w:lsdException w:name="toc 3" w:semiHidden="1" w:uiPriority="39" w:unhideWhenUsed="1"/>
+    <w:lsdException w:name="toc 4" w:semiHidden="1" w:uiPriority="39" w:unhideWhenUsed="1"/>
+    <w:lsdException w:name="toc 5" w:semiHidden="1" w:uiPriority="39" w:unhideWhenUsed="1"/>
+    <w:lsdException w:name="toc 6" w:semiHidden="1" w:uiPriority="39" w:unhideWhenUsed="1"/>
+    <w:lsdException w:name="toc 7" w:semiHidden="1" w:uiPriority="39" w:unhideWhenUsed="1"/>
+    <w:lsdException w:name="toc 8" w:semiHidden="1" w:uiPriority="39" w:unhideWhenUsed="1"/>
+    <w:lsdException w:name="toc 9" w:semiHidden="1" w:uiPriority="39" w:unhideWhenUsed="1"/>
+    <w:lsdException w:name="Normal Indent" w:semiHidden="1" w:unhideWhenUsed="1"/>
+    <w:lsdException w:name="footnote text" w:semiHidden="1" w:unhideWhenUsed="1"/>
+    <w:lsdException w:name="annotation text" w:semiHidden="1" w:unhideWhenUsed="1"/>
+    <w:lsdException w:name="header" w:semiHidden="1" w:unhideWhenUsed="1"/>
+    <w:lsdException w:name="footer" w:semiHidden="1" w:unhideWhenUsed="1"/>
+    <w:lsdException w:name="index heading" w:semiHidden="1" w:unhideWhenUsed="1"/>
+    <w:lsdException w:name="caption" w:semiHidden="1" w:uiPriority="35" w:unhideWhenUsed="1" w:qFormat="1"/>
+    <w:lsdException w:name="table of figures" w:semiHidden="1" w:unhideWhenUsed="1"/>
+    <w:lsdException w:name="envelope address" w:semiHidden="1" w:unhideWhenUsed="1"/>
+    <w:lsdException w:name="envelope return" w:semiHidden="1" w:unhideWhenUsed="1"/>
+    <w:lsdException w:name="footnote reference" w:semiHidden="1" w:unhideWhenUsed="1"/>
+    <w:lsdException w:name="annotation reference" w:semiHidden="1" w:unhideWhenUsed="1"/>
+    <w:lsdException w:name="line number" w:semiHidden="1" w:unhideWhenUsed="1"/>
+    <w:lsdException w:name="page number" w:semiHidden="1" w:unhideWhenUsed="1"/>
+    <w:lsdException w:name="endnote reference" w:semiHidden="1" w:unhideWhenUsed="1"/>
+    <w:lsdException w:name="endnote text" w:semiHidden="1" w:unhideWhenUsed="1"/>
+    <w:lsdException w:name="table of authorities" w:semiHidden="1" w:unhideWhenUsed="1"/>
+    <w:lsdException w:name="macro" w:semiHidden="1" w:unhideWhenUsed="1"/>
+    <w:lsdException w:name="toa heading" w:semiHidden="1" w:unhideWhenUsed="1"/>
+    <w:lsdException w:name="List" w:semiHidden="1" w:unhideWhenUsed="1"/>
+    <w:lsdException w:name="List Bullet" w:semiHidden="1" w:unhideWhenUsed="1"/>
+    <w:lsdException w:name="List Number" w:semiHidden="1" w:unhideWhenUsed="1"/>
+    <w:lsdException w:name="List 2" w:semiHidden="1" w:unhideWhenUsed="1"/>
+    <w:lsdException w:name="List 3" w:semiHidden="1" w:unhideWhenUsed="1"/>
+    <w:lsdException w:name="List 4" w:semiHidden="1" w:unhideWhenUsed="1"/>
+    <w:lsdException w:name="List 5" w:semiHidden="1" w:unhideWhenUsed="1"/>
+    <w:lsdException w:name="List Bullet 2" w:semiHidden="1" w:unhideWhenUsed="1"/>
+    <w:lsdException w:name="List Bullet 3" w:semiHidden="1" w:unhideWhenUsed="1"/>
+    <w:lsdException w:name="List Bullet 4" w:semiHidden="1" w:unhideWhenUsed="1"/>
+    <w:lsdException w:name="List Bullet 5" w:semiHidden="1" w:unhideWhenUsed="1"/>
+    <w:lsdException w:name="List Number 2" w:semiHidden="1" w:unhideWhenUsed="1"/>
+    <w:lsdException w:name="List Number 3" w:semiHidden="1" w:unhideWhenUsed="1"/>
+    <w:lsdException w:name="List Number 4" w:semiHidden="1" w:unhideWhenUsed="1"/>
+    <w:lsdException w:name="List Number 5" w:semiHidden="1" w:unhideWhenUsed="1"/>
+    <w:lsdException w:name="Title" w:uiPriority="10" w:qFormat="1"/>
+    <w:lsdException w:name="Closing" w:semiHidden="1" w:unhideWhenUsed="1"/>
+    <w:lsdException w:name="Signature" w:semiHidden="1" w:unhideWhenUsed="1"/>
+    <w:lsdException w:name="Default Paragraph Font" w:semiHidden="1" w:uiPriority="1" w:unhideWhenUsed="1"/>
+    <w:lsdException w:name="Body Text" w:semiHidden="1" w:unhideWhenUsed="1"/>
+    <w:lsdException w:name="Body Text Indent" w:semiHidden="1" w:unhideWhenUsed="1"/>
+    <w:lsdException w:name="List Continue" w:semiHidden="1" w:unhideWhenUsed="1"/>
+    <w:lsdException w:name="List Continue 2" w:semiHidden="1" w:unhideWhenUsed="1"/>
+    <w:lsdException w:name="List Continue 3" w:semiHidden="1" w:unhideWhenUsed="1"/>
+    <w:lsdException w:name="List Continue 4" w:semiHidden="1" w:unhideWhenUsed="1"/>
+    <w:lsdException w:name="List Continue 5" w:semiHidden="1" w:unhideWhenUsed="1"/>
+    <w:lsdException w:name="Message Header" w:semiHidden="1" w:unhideWhenUsed="1"/>
+    <w:lsdException w:name="Subtitle" w:uiPriority="11" w:qFormat="1"/>
+    <w:lsdException w:name="Salutation" w:semiHidden="1" w:unhideWhenUsed="1"/>
+    <w:lsdException w:name="Date" w:semiHidden="1" w:unhideWhenUsed="1"/>
+    <w:lsdException w:name="Body Text First Indent" w:semiHidden="1" w:unhideWhenUsed="1"/>
+    <w:lsdException w:name="Body Text First Indent 2" w:semiHidden="1" w:unhideWhenUsed="1"/>
+    <w:lsdException w:name="Note Heading" w:semiHidden="1" w:unhideWhenUsed="1"/>
+    <w:lsdException w:name="Body Text 2" w:semiHidden="1" w:unhideWhenUsed="1"/>
+    <w:lsdException w:name="Body Text 3" w:semiHidden="1" w:unhideWhenUsed="1"/>
+    <w:lsdException w:name="Body Text Indent 2" w:semiHidden="1" w:unhideWhenUsed="1"/>
+    <w:lsdException w:name="Body Text Indent 3" w:semiHidden="1" w:unhideWhenUsed="1"/>
+    <w:lsdException w:name="Block Text" w:semiHidden="1" w:unhideWhenUsed="1"/>
+    <w:lsdException w:name="Hyperlink" w:semiHidden="1" w:unhideWhenUsed="1"/>
+    <w:lsdException w:name="FollowedHyperlink" w:semiHidden="1" w:unhideWhenUsed="1"/>
+    <w:lsdException w:name="Strong" w:uiPriority="22" w:qFormat="1"/>
+    <w:lsdException w:name="Emphasis" w:uiPriority="20" w:qFormat="1"/>
+    <w:lsdException w:name="Document Map" w:semiHidden="1" w:unhideWhenUsed="1"/>
+    <w:lsdException w:name="Plain Text" w:semiHidden="1" w:unhideWhenUsed="1"/>
+    <w:lsdException w:name="E-mail Signature" w:semiHidden="1" w:unhideWhenUsed="1"/>
+    <w:lsdException w:name="HTML Top of Form" w:semiHidden="1" w:unhideWhenUsed="1"/>
+    <w:lsdException w:name="HTML Bottom of Form" w:semiHidden="1" w:unhideWhenUsed="1"/>
+    <w:lsdException w:name="Normal (Web)" w:semiHidden="1" w:unhideWhenUsed="1"/>
+    <w:lsdException w:name="HTML Acronym" w:semiHidden="1" w:unhideWhenUsed="1"/>
+    <w:lsdException w:name="HTML Address" w:semiHidden="1" w:unhideWhenUsed="1"/>
+    <w:lsdException w:name="HTML Cite" w:semiHidden="1" w:unhideWhenUsed="1"/>
+    <w:lsdException w:name="HTML Code" w:semiHidden="1" w:unhideWhenUsed="1"/>
+    <w:lsdException w:name="HTML Definition" w:semiHidden="1" w:unhideWhenUsed="1"/>
+    <w:lsdException w:name="HTML Keyboard" w:semiHidden="1" w:unhideWhenUsed="1"/>
+    <w:lsdException w:name="HTML Preformatted" w:semiHidden="1" w:unhideWhenUsed="1"/>
+    <w:lsdException w:name="HTML Sample" w:semiHidden="1" w:unhideWhenUsed="1"/>
+    <w:lsdException w:name="HTML Typewriter" w:semiHidden="1" w:unhideWhenUsed="1"/>
+    <w:lsdException w:name="HTML Variable" w:semiHidden="1" w:unhideWhenUsed="1"/>
+    <w:lsdException w:name="Normal Table" w:semiHidden="1" w:unhideWhenUsed="1"/>
+    <w:lsdException w:name="annotation subject" w:semiHidden="1" w:unhideWhenUsed="1"/>
+    <w:lsdException w:name="No List" w:semiHidden="1" w:unhideWhenUsed="1"/>
+    <w:lsdException w:name="Outline List 1" w:semiHidden="1" w:unhideWhenUsed="1"/>
+    <w:lsdException w:name="Outline List 2" w:semiHidden="1" w:unhideWhenUsed="1"/>
+    <w:lsdException w:name="Outline List 3" w:semiHidden="1" w:unhideWhenUsed="1"/>
+    <w:lsdException w:name="Table Simple 1" w:semiHidden="1" w:unhideWhenUsed="1"/>
+    <w:lsdException w:name="Table Simple 2" w:semiHidden="1" w:unhideWhenUsed="1"/>
+    <w:lsdException w:name="Table Simple 3" w:semiHidden="1" w:unhideWhenUsed="1"/>
+    <w:lsdException w:name="Table Classic 1" w:semiHidden="1" w:unhideWhenUsed="1"/>
+    <w:lsdException w:name="Table Classic 2" w:semiHidden="1" w:unhideWhenUsed="1"/>
+    <w:lsdException w:name="Table Classic 3" w:semiHidden="1" w:unhideWhenUsed="1"/>
+    <w:lsdException w:name="Table Classic 4" w:semiHidden="1" w:unhideWhenUsed="1"/>
+    <w:lsdException w:name="Table Colorful 1" w:semiHidden="1" w:unhideWhenUsed="1"/>
+    <w:lsdException w:name="Table Colorful 2" w:semiHidden="1" w:unhideWhenUsed="1"/>
+    <w:lsdException w:name="Table Colorful 3" w:semiHidden="1" w:unhideWhenUsed="1"/>
+    <w:lsdException w:name="Table Columns 1" w:semiHidden="1" w:unhideWhenUsed="1"/>
+    <w:lsdException w:name="Table Columns 2" w:semiHidden="1" w:unhideWhenUsed="1"/>
+    <w:lsdException w:name="Table Columns 3" w:semiHidden="1" w:unhideWhenUsed="1"/>
+    <w:lsdException w:name="Table Columns 4" w:semiHidden="1" w:unhideWhenUsed="1"/>
+    <w:lsdException w:name="Table Columns 5" w:semiHidden="1" w:unhideWhenUsed="1"/>
+    <w:lsdException w:name="Table Grid 1" w:semiHidden="1" w:unhideWhenUsed="1"/>
+    <w:lsdException w:name="Table Grid 2" w:semiHidden="1" w:unhideWhenUsed="1"/>
+    <w:lsdException w:name="Table Grid 3" w:semiHidden="1" w:unhideWhenUsed="1"/>
+    <w:lsdException w:name="Table Grid 4" w:semiHidden="1" w:unhideWhenUsed="1"/>
+    <w:lsdException w:name="Table Grid 5" w:semiHidden="1" w:unhideWhenUsed="1"/>
+    <w:lsdException w:name="Table Grid 6" w:semiHidden="1" w:unhideWhenUsed="1"/>
+    <w:lsdException w:name="Table Grid 7" w:semiHidden="1" w:unhideWhenUsed="1"/>
+    <w:lsdException w:name="Table Grid 8" w:semiHidden="1" w:unhideWhenUsed="1"/>
+    <w:lsdException w:name="Table List 1" w:semiHidden="1" w:unhideWhenUsed="1"/>
+    <w:lsdException w:name="Table List 2" w:semiHidden="1" w:unhideWhenUsed="1"/>
+    <w:lsdException w:name="Table List 3" w:semiHidden="1" w:unhideWhenUsed="1"/>
+    <w:lsdException w:name="Table List 4" w:semiHidden="1" w:unhideWhenUsed="1"/>
+    <w:lsdException w:name="Table List 5" w:semiHidden="1" w:unhideWhenUsed="1"/>
+    <w:lsdException w:name="Table List 6" w:semiHidden="1" w:unhideWhenUsed="1"/>
+    <w:lsdException w:name="Table List 7" w:semiHidden="1" w:unhideWhenUsed="1"/>
+    <w:lsdException w:name="Table List 8" w:semiHidden="1" w:unhideWhenUsed="1"/>
+    <w:lsdException w:name="Table 3D effects 1" w:semiHidden="1" w:unhideWhenUsed="1"/>
+    <w:lsdException w:name="Table 3D effects 2" w:semiHidden="1" w:unhideWhenUsed="1"/>
+    <w:lsdException w:name="Table 3D effects 3" w:semiHidden="1" w:unhideWhenUsed="1"/>
+    <w:lsdException w:name="Table Contemporary" w:semiHidden="1" w:unhideWhenUsed="1"/>
+    <w:lsdException w:name="Table Elegant" w:semiHidden="1" w:unhideWhenUsed="1"/>
+    <w:lsdException w:name="Table Professional" w:semiHidden="1" w:unhideWhenUsed="1"/>
+    <w:lsdException w:name="Table Subtle 1" w:semiHidden="1" w:unhideWhenUsed="1"/>
+    <w:lsdException w:name="Table Subtle 2" w:semiHidden="1" w:unhideWhenUsed="1"/>
+    <w:lsdException w:name="Table Web 1" w:semiHidden="1" w:unhideWhenUsed="1"/>
+    <w:lsdException w:name="Table Web 2" w:semiHidden="1" w:unhideWhenUsed="1"/>
+    <w:lsdException w:name="Table Web 3" w:semiHidden="1" w:unhideWhenUsed="1"/>
+    <w:lsdException w:name="Balloon Text" w:semiHidden="1" w:unhideWhenUsed="1"/>
+    <w:lsdException w:name="Table Grid" w:uiPriority="39"/>
+    <w:lsdException w:name="Table Theme" w:semiHidden="1" w:unhideWhenUsed="1"/>
+    <w:lsdException w:name="Placeholder Text" w:semiHidden="1"/>
+    <w:lsdException w:name="No Spacing" w:uiPriority="1" w:qFormat="1"/>
+    <w:lsdException w:name="Light Shading" w:uiPriority="60"/>
+    <w:lsdException w:name="Light List" w:uiPriority="61"/>
+    <w:lsdException w:name="Light Grid" w:uiPriority="62"/>
+    <w:lsdException w:name="Medium Shading 1" w:uiPriority="63"/>
+    <w:lsdException w:name="Medium Shading 2" w:uiPriority="64"/>
+    <w:lsdException w:name="Medium List 1" w:uiPriority="65"/>
+    <w:lsdException w:name="Medium List 2" w:uiPriority="66"/>
+    <w:lsdException w:name="Medium Grid 1" w:uiPriority="67"/>
+    <w:lsdException w:name="Medium Grid 2" w:uiPriority="68"/>
+    <w:lsdException w:name="Medium Grid 3" w:uiPriority="69"/>
+    <w:lsdException w:name="Dark List" w:uiPriority="70"/>
+    <w:lsdException w:name="Colorful Shading" w:uiPriority="71"/>
+    <w:lsdException w:name="Colorful List" w:uiPriority="72"/>
+    <w:lsdException w:name="Colorful Grid" w:uiPriority="73"/>
+    <w:lsdException w:name="Light Shading Accent 1" w:uiPriority="60"/>
+    <w:lsdException w:name="Light List Accent 1" w:uiPriority="61"/>
+    <w:lsdException w:name="Light Grid Accent 1" w:uiPriority="62"/>
+    <w:lsdException w:name="Medium Shading 1 Accent 1" w:uiPriority="63"/>
+    <w:lsdException w:name="Medium Shading 2 Accent 1" w:uiPriority="64"/>
+    <w:lsdException w:name="Medium List 1 Accent 1" w:uiPriority="65"/>
+    <w:lsdException w:name="Revision" w:semiHidden="1"/>
+    <w:lsdException w:name="List Paragraph" w:uiPriority="34" w:qFormat="1"/>
+    <w:lsdException w:name="Quote" w:uiPriority="29" w:qFormat="1"/>
+    <w:lsdException w:name="Intense Quote" w:uiPriority="30" w:qFormat="1"/>
+    <w:lsdException w:name="Medium List 2 Accent 1" w:uiPriority="66"/>
+    <w:lsdException w:name="Medium Grid 1 Accent 1" w:uiPriority="67"/>
+    <w:lsdException w:name="Medium Grid 2 Accent 1" w:uiPriority="68"/>
+    <w:lsdException w:name="Medium Grid 3 Accent 1" w:uiPriority="69"/>
+    <w:lsdException w:name="Dark List Accent 1" w:uiPriority="70"/>
+    <w:lsdException w:name="Colorful Shading Accent 1" w:uiPriority="71"/>
+    <w:lsdException w:name="Colorful List Accent 1" w:uiPriority="72"/>
+    <w:lsdException w:name="Colorful Grid Accent 1" w:uiPriority="73"/>
+    <w:lsdException w:name="Light Shading Accent 2" w:uiPriority="60"/>
+    <w:lsdException w:name="Light List Accent 2" w:uiPriority="61"/>
+    <w:lsdException w:name="Light Grid Accent 2" w:uiPriority="62"/>
+    <w:lsdException w:name="Medium Shading 1 Accent 2" w:uiPriority="63"/>
+    <w:lsdException w:name="Medium Shading 2 Accent 2" w:uiPriority="64"/>
+    <w:lsdException w:name="Medium List 1 Accent 2" w:uiPriority="65"/>
+    <w:lsdException w:name="Medium List 2 Accent 2" w:uiPriority="66"/>
+    <w:lsdException w:name="Medium Grid 1 Accent 2" w:uiPriority="67"/>
+    <w:lsdException w:name="Medium Grid 2 Accent 2" w:uiPriority="68"/>
+    <w:lsdException w:name="Medium Grid 3 Accent 2" w:uiPriority="69"/>
+    <w:lsdException w:name="Dark List Accent 2" w:uiPriority="70"/>
+    <w:lsdException w:name="Colorful Shading Accent 2" w:uiPriority="71"/>
+    <w:lsdException w:name="Colorful List Accent 2" w:uiPriority="72"/>
+    <w:lsdException w:name="Colorful Grid Accent 2" w:uiPriority="73"/>
+    <w:lsdException w:name="Light Shading Accent 3" w:uiPriority="60"/>
+    <w:lsdException w:name="Light List Accent 3" w:uiPriority="61"/>
+    <w:lsdException w:name="Light Grid Accent 3" w:uiPriority="62"/>
+    <w:lsdException w:name="Medium Shading 1 Accent 3" w:uiPriority="63"/>
+    <w:lsdException w:name="Medium Shading 2 Accent 3" w:uiPriority="64"/>
+    <w:lsdException w:name="Medium List 1 Accent 3" w:uiPriority="65"/>
+    <w:lsdException w:name="Medium List 2 Accent 3" w:uiPriority="66"/>
+    <w:lsdException w:name="Medium Grid 1 Accent 3" w:uiPriority="67"/>
+    <w:lsdException w:name="Medium Grid 2 Accent 3" w:uiPriority="68"/>
+    <w:lsdException w:name="Medium Grid 3 Accent 3" w:uiPriority="69"/>
+    <w:lsdException w:name="Dark List Accent 3" w:uiPriority="70"/>
+    <w:lsdException w:name="Colorful Shading Accent 3" w:uiPriority="71"/>
+    <w:lsdException w:name="Colorful List Accent 3" w:uiPriority="72"/>
+    <w:lsdException w:name="Colorful Grid Accent 3" w:uiPriority="73"/>
+    <w:lsdException w:name="Light Shading Accent 4" w:uiPriority="60"/>
+    <w:lsdException w:name="Light List Accent 4" w:uiPriority="61"/>
+    <w:lsdException w:name="Light Grid Accent 4" w:uiPriority="62"/>
+    <w:lsdException w:name="Medium Shading 1 Accent 4" w:uiPriority="63"/>
+    <w:lsdException w:name="Medium Shading 2 Accent 4" w:uiPriority="64"/>
+    <w:lsdException w:name="Medium List 1 Accent 4" w:uiPriority="65"/>
+    <w:lsdException w:name="Medium List 2 Accent 4" w:uiPriority="66"/>
+    <w:lsdException w:name="Medium Grid 1 Accent 4" w:uiPriority="67"/>
+    <w:lsdException w:name="Medium Grid 2 Accent 4" w:uiPriority="68"/>
+    <w:lsdException w:name="Medium Grid 3 Accent 4" w:uiPriority="69"/>
+    <w:lsdException w:name="Dark List Accent 4" w:uiPriority="70"/>
+    <w:lsdException w:name="Colorful Shading Accent 4" w:uiPriority="71"/>
+    <w:lsdException w:name="Colorful List Accent 4" w:uiPriority="72"/>
+    <w:lsdException w:name="Colorful Grid Accent 4" w:uiPriority="73"/>
+    <w:lsdException w:name="Light Shading Accent 5" w:uiPriority="60"/>
+    <w:lsdException w:name="Light List Accent 5" w:uiPriority="61"/>
+    <w:lsdException w:name="Light Grid Accent 5" w:uiPriority="62"/>
+    <w:lsdException w:name="Medium Shading 1 Accent 5" w:uiPriority="63"/>
+    <w:lsdException w:name="Medium Shading 2 Accent 5" w:uiPriority="64"/>
+    <w:lsdException w:name="Medium List 1 Accent 5" w:uiPriority="65"/>
+    <w:lsdException w:name="Medium List 2 Accent 5" w:uiPriority="66"/>
+    <w:lsdException w:name="Medium Grid 1 Accent 5" w:uiPriority="67"/>
+    <w:lsdException w:name="Medium Grid 2 Accent 5" w:uiPriority="68"/>
+    <w:lsdException w:name="Medium Grid 3 Accent 5" w:uiPriority="69"/>
+    <w:lsdException w:name="Dark List Accent 5" w:uiPriority="70"/>
+    <w:lsdException w:name="Colorful Shading Accent 5" w:uiPriority="71"/>
+    <w:lsdException w:name="Colorful List Accent 5" w:uiPriority="72"/>
+    <w:lsdException w:name="Colorful Grid Accent 5" w:uiPriority="73"/>
+    <w:lsdException w:name="Light Shading Accent 6" w:uiPriority="60"/>
+    <w:lsdException w:name="Light List Accent 6" w:uiPriority="61"/>
+    <w:lsdException w:name="Light Grid Accent 6" w:uiPriority="62"/>
+    <w:lsdException w:name="Medium Shading 1 Accent 6" w:uiPriority="63"/>
+    <w:lsdException w:name="Medium Shading 2 Accent 6" w:uiPriority="64"/>
+    <w:lsdException w:name="Medium List 1 Accent 6" w:uiPriority="65"/>
+    <w:lsdException w:name="Medium List 2 Accent 6" w:uiPriority="66"/>
+    <w:lsdException w:name="Medium Grid 1 Accent 6" w:uiPriority="67"/>
+    <w:lsdException w:name="Medium Grid 2 Accent 6" w:uiPriority="68"/>
+    <w:lsdException w:name="Medium Grid 3 Accent 6" w:uiPriority="69"/>
+    <w:lsdException w:name="Dark List Accent 6" w:uiPriority="70"/>
+    <w:lsdException w:name="Colorful Shading Accent 6" w:uiPriority="71"/>
+    <w:lsdException w:name="Colorful List Accent 6" w:uiPriority="72"/>
+    <w:lsdException w:name="Colorful Grid Accent 6" w:uiPriority="73"/>
+    <w:lsdException w:name="Subtle Emphasis" w:uiPriority="19" w:qFormat="1"/>
+    <w:lsdException w:name="Intense Emphasis" w:uiPriority="21" w:qFormat="1"/>
+    <w:lsdException w:name="Subtle Reference" w:uiPriority="31" w:qFormat="1"/>
+    <w:lsdException w:name="Intense Reference" w:uiPriority="32" w:qFormat="1"/>
+    <w:lsdException w:name="Book Title" w:uiPriority="33" w:qFormat="1"/>
+    <w:lsdException w:name="Bibliography" w:semiHidden="1" w:uiPriority="37" w:unhideWhenUsed="1"/>
+    <w:lsdException w:name="TOC Heading" w:semiHidden="1" w:uiPriority="39" w:unhideWhenUsed="1" w:qFormat="1"/>
+    <w:lsdException w:name="Plain Table 1" w:uiPriority="41"/>
+    <w:lsdException w:name="Plain Table 2" w:uiPriority="42"/>
+    <w:lsdException w:name="Plain Table 3" w:uiPriority="43"/>
+    <w:lsdException w:name="Plain Table 4" w:uiPriority="44"/>
+    <w:lsdException w:name="Plain Table 5" w:uiPriority="45"/>
+    <w:lsdException w:name="Grid Table Light" w:uiPriority="40"/>
+    <w:lsdException w:name="Grid Table 1 Light" w:uiPriority="46"/>
+    <w:lsdException w:name="Grid Table 2" w:uiPriority="47"/>
+    <w:lsdException w:name="Grid Table 3" w:uiPriority="48"/>
+    <w:lsdException w:name="Grid Table 4" w:uiPriority="49"/>
+    <w:lsdException w:name="Grid Table 5 Dark" w:uiPriority="50"/>
+    <w:lsdException w:name="Grid Table 6 Colorful" w:uiPriority="51"/>
+    <w:lsdException w:name="Grid Table 7 Colorful" w:uiPriority="52"/>
+    <w:lsdException w:name="Grid Table 1 Light Accent 1" w:uiPriority="46"/>
+    <w:lsdException w:name="Grid Table 2 Accent 1" w:uiPriority="47"/>
+    <w:lsdException w:name="Grid Table 3 Accent 1" w:uiPriority="48"/>
+    <w:lsdException w:name="Grid Table 4 Accent 1" w:uiPriority="49"/>
+    <w:lsdException w:name="Grid Table 5 Dark Accent 1" w:uiPriority="50"/>
+    <w:lsdException w:name="Grid Table 6 Colorful Accent 1" w:uiPriority="51"/>
+    <w:lsdException w:name="Grid Table 7 Colorful Accent 1" w:uiPriority="52"/>
+    <w:lsdException w:name="Grid Table 1 Light Accent 2" w:uiPriority="46"/>
+    <w:lsdException w:name="Grid Table 2 Accent 2" w:uiPriority="47"/>
+    <w:lsdException w:name="Grid Table 3 Accent 2" w:uiPriority="48"/>
+    <w:lsdException w:name="Grid Table 4 Accent 2" w:uiPriority="49"/>
+    <w:lsdException w:name="Grid Table 5 Dark Accent 2" w:uiPriority="50"/>
+    <w:lsdException w:name="Grid Table 6 Colorful Accent 2" w:uiPriority="51"/>
+    <w:lsdException w:name="Grid Table 7 Colorful Accent 2" w:uiPriority="52"/>
+    <w:lsdException w:name="Grid Table 1 Light Accent 3" w:uiPriority="46"/>
+    <w:lsdException w:name="Grid Table 2 Accent 3" w:uiPriority="47"/>
+    <w:lsdException w:name="Grid Table 3 Accent 3" w:uiPriority="48"/>
+    <w:lsdException w:name="Grid Table 4 Accent 3" w:uiPriority="49"/>
+    <w:lsdException w:name="Grid Table 5 Dark Accent 3" w:uiPriority="50"/>
+    <w:lsdException w:name="Grid Table 6 Colorful Accent 3" w:uiPriority="51"/>
+    <w:lsdException w:name="Grid Table 7 Colorful Accent 3" w:uiPriority="52"/>
+    <w:lsdException w:name="Grid Table 1 Light Accent 4" w:uiPriority="46"/>
+    <w:lsdException w:name="Grid Table 2 Accent 4" w:uiPriority="47"/>
+    <w:lsdException w:name="Grid Table 3 Accent 4" w:uiPriority="48"/>
+    <w:lsdException w:name="Grid Table 4 Accent 4" w:uiPriority="49"/>
+    <w:lsdException w:name="Grid Table 5 Dark Accent 4" w:uiPriority="50"/>
+    <w:lsdException w:name="Grid Table 6 Colorful Accent 4" w:uiPriority="51"/>
+    <w:lsdException w:name="Grid Table 7 Colorful Accent 4" w:uiPriority="52"/>
+    <w:lsdException w:name="Grid Table 1 Light Accent 5" w:uiPriority="46"/>
+    <w:lsdException w:name="Grid Table 2 Accent 5" w:uiPriority="47"/>
+    <w:lsdException w:name="Grid Table 3 Accent 5" w:uiPriority="48"/>
+    <w:lsdException w:name="Grid Table 4 Accent 5" w:uiPriority="49"/>
+    <w:lsdException w:name="Grid Table 5 Dark Accent 5" w:uiPriority="50"/>
+    <w:lsdException w:name="Grid Table 6 Colorful Accent 5" w:uiPriority="51"/>
+    <w:lsdException w:name="Grid Table 7 Colorful Accent 5" w:uiPriority="52"/>
+    <w:lsdException w:name="Grid Table 1 Light Accent 6" w:uiPriority="46"/>
+    <w:lsdException w:name="Grid Table 2 Accent 6" w:uiPriority="47"/>
+    <w:lsdException w:name="Grid Table 3 Accent 6" w:uiPriority="48"/>
+    <w:lsdException w:name="Grid Table 4 Accent 6" w:uiPriority="49"/>
+    <w:lsdException w:name="Grid Table 5 Dark Accent 6" w:uiPriority="50"/>
+    <w:lsdException w:name="Grid Table 6 Colorful Accent 6" w:uiPriority="51"/>
+    <w:lsdException w:name="Grid Table 7 Colorful Accent 6" w:uiPriority="52"/>
+    <w:lsdException w:name="List Table 1 Light" w:uiPriority="46"/>
+    <w:lsdException w:name="List Table 2" w:uiPriority="47"/>
+    <w:lsdException w:name="List Table 3" w:uiPriority="48"/>
+    <w:lsdException w:name="List Table 4" w:uiPriority="49"/>
+    <w:lsdException w:name="List Table 5 Dark" w:uiPriority="50"/>
+    <w:lsdException w:name="List Table 6 Colorful" w:uiPriority="51"/>
+    <w:lsdException w:name="List Table 7 Colorful" w:uiPriority="52"/>
+    <w:lsdException w:name="List Table 1 Light Accent 1" w:uiPriority="46"/>
+    <w:lsdException w:name="List Table 2 Accent 1" w:uiPriority="47"/>
+    <w:lsdException w:name="List Table 3 Accent 1" w:uiPriority="48"/>
+    <w:lsdException w:name="List Table 4 Accent 1" w:uiPriority="49"/>
+    <w:lsdException w:name="List Table 5 Dark Accent 1" w:uiPriority="50"/>
+    <w:lsdException w:name="List Table 6 Colorful Accent 1" w:uiPriority="51"/>
+    <w:lsdException w:name="List Table 7 Colorful Accent 1" w:uiPriority="52"/>
+    <w:lsdException w:name="List Table 1 Light Accent 2" w:uiPriority="46"/>
+    <w:lsdException w:name="List Table 2 Accent 2" w:uiPriority="47"/>
+    <w:lsdException w:name="List Table 3 Accent 2" w:uiPriority="48"/>
+    <w:lsdException w:name="List Table 4 Accent 2" w:uiPriority="49"/>
+    <w:lsdException w:name="List Table 5 Dark Accent 2" w:uiPriority="50"/>
+    <w:lsdException w:name="List Table 6 Colorful Accent 2" w:uiPriority="51"/>
+    <w:lsdException w:name="List Table 7 Colorful Accent 2" w:uiPriority="52"/>
+    <w:lsdException w:name="List Table 1 Light Accent 3" w:uiPriority="46"/>
+    <w:lsdException w:name="List Table 2 Accent 3" w:uiPriority="47"/>
+    <w:lsdException w:name="List Table 3 Accent 3" w:uiPriority="48"/>
+    <w:lsdException w:name="List Table 4 Accent 3" w:uiPriority="49"/>
+    <w:lsdException w:name="List Table 5 Dark Accent 3" w:uiPriority="50"/>
+    <w:lsdException w:name="List Table 6 Colorful Accent 3" w:uiPriority="51"/>
+    <w:lsdException w:name="List Table 7 Colorful Accent 3" w:uiPriority="52"/>
+    <w:lsdException w:name="List Table 1 Light Accent 4" w:uiPriority="46"/>
+    <w:lsdException w:name="List Table 2 Accent 4" w:uiPriority="47"/>
+    <w:lsdException w:name="List Table 3 Accent 4" w:uiPriority="48"/>
+    <w:lsdException w:name="List Table 4 Accent 4" w:uiPriority="49"/>
+    <w:lsdException w:name="List Table 5 Dark Accent 4" w:uiPriority="50"/>
+    <w:lsdException w:name="List Table 6 Colorful Accent 4" w:uiPriority="51"/>
+    <w:lsdException w:name="List Table 7 Colorful Accent 4" w:uiPriority="52"/>
+    <w:lsdException w:name="List Table 1 Light Accent 5" w:uiPriority="46"/>
+    <w:lsdException w:name="List Table 2 Accent 5" w:uiPriority="47"/>
+    <w:lsdException w:name="List Table 3 Accent 5" w:uiPriority="48"/>
+    <w:lsdException w:name="List Table 4 Accent 5" w:uiPriority="49"/>
+    <w:lsdException w:name="List Table 5 Dark Accent 5" w:uiPriority="50"/>
+    <w:lsdException w:name="List Table 6 Colorful Accent 5" w:uiPriority="51"/>
+    <w:lsdException w:name="List Table 7 Colorful Accent 5" w:uiPriority="52"/>
+    <w:lsdException w:name="List Table 1 Light Accent 6" w:uiPriority="46"/>
+    <w:lsdException w:name="List Table 2 Accent 6" w:uiPriority="47"/>
+    <w:lsdException w:name="List Table 3 Accent 6" w:uiPriority="48"/>
+    <w:lsdException w:name="List Table 4 Accent 6" w:uiPriority="49"/>
+    <w:lsdException w:name="List Table 5 Dark Accent 6" w:uiPriority="50"/>
+    <w:lsdException w:name="List Table 6 Colorful Accent 6" w:uiPriority="51"/>
+    <w:lsdException w:name="List Table 7 Colorful Accent 6" w:uiPriority="52"/>
+    <w:lsdException w:name="Mention" w:semiHidden="1" w:unhideWhenUsed="1"/>
+    <w:lsdException w:name="Smart Hyperlink" w:semiHidden="1" w:unhideWhenUsed="1"/>
+    <w:lsdException w:name="Hashtag" w:semiHidden="1" w:unhideWhenUsed="1"/>
+    <w:lsdException w:name="Unresolved Mention" w:semiHidden="1" w:unhideWhenUsed="1"/>
+    <w:lsdException w:name="Smart Link" w:semiHidden="1" w:unhideWhenUsed="1"/>
+  </w:latentStyles>
+  <w:style w:type="paragraph" w:default="1" w:styleId="Normal">
+    <w:name w:val="Normal"/>
+    <w:qFormat/>
+    <w:rsid w:val="00FC693F"/>
+    <w:pPr>
+      <w:spacing w:after="140" w:line="264" w:lineRule="auto"/>
     </w:pPr>
     <w:rPr>
-      <w:rFonts w:ascii="Arial" w:hAnsi="Arial" w:cs="Arial" w:eastAsia="Arial"/>
-      <w:b w:val="0"/>
       <w:color w:val="000000"/>
-      <w:sz w:val="22"/>
     </w:rPr>
   </w:style>
   <w:style w:type="paragraph" w:styleId="Heading1">
     <w:name w:val="heading 1"/>
     <w:basedOn w:val="Normal"/>
     <w:next w:val="Normal"/>
+    <w:uiPriority w:val="9"/>
+    <w:qFormat/>
+    <w:rsid w:val="00FC693F"/>
     <w:pPr>
       <w:keepNext/>
-      <w:keepLines w:val="1"/>
-      <w:pageBreakBefore w:val="0"/>
-      <w:spacing w:after="120" w:before="280" w:lineRule="auto" w:line="264"/>
+      <w:keepLines/>
+      <w:spacing w:before="240"/>
+      <w:outlineLvl w:val="0"/>
     </w:pPr>
     <w:rPr>
-      <w:rFonts w:ascii="Arial" w:hAnsi="Arial" w:cs="Arial" w:eastAsia="Arial"/>
       <w:b/>
-      <w:color w:val="000000"/>
+      <w:bCs/>
       <w:sz w:val="30"/>
-      <w:szCs w:val="40"/>
+      <w:szCs w:val="28"/>
     </w:rPr>
   </w:style>
   <w:style w:type="paragraph" w:styleId="Heading2">
     <w:name w:val="heading 2"/>
     <w:basedOn w:val="Normal"/>
     <w:next w:val="Normal"/>
+    <w:uiPriority w:val="9"/>
+    <w:unhideWhenUsed/>
+    <w:qFormat/>
+    <w:rsid w:val="00FC693F"/>
     <w:pPr>
       <w:keepNext/>
-      <w:keepLines w:val="1"/>
-      <w:pageBreakBefore w:val="0"/>
-      <w:spacing w:after="120" w:before="280" w:lineRule="auto" w:line="264"/>
+      <w:keepLines/>
+      <w:spacing w:before="240"/>
+      <w:outlineLvl w:val="1"/>
     </w:pPr>
     <w:rPr>
-      <w:rFonts w:ascii="Arial" w:hAnsi="Arial" w:cs="Arial" w:eastAsia="Arial"/>
       <w:b/>
-      <w:bCs w:val="0"/>
-      <w:color w:val="000000"/>
+      <w:bCs/>
       <w:sz w:val="24"/>
-      <w:szCs w:val="32"/>
+      <w:szCs w:val="26"/>
     </w:rPr>
   </w:style>
   <w:style w:type="paragraph" w:styleId="Heading3">
     <w:name w:val="heading 3"/>
     <w:basedOn w:val="Normal"/>
     <w:next w:val="Normal"/>
-    <w:pPr>
-      <w:keepNext w:val="1"/>
-      <w:keepLines w:val="1"/>
-      <w:pageBreakBefore w:val="0"/>
-      <w:spacing w:after="80" w:before="320" w:lineRule="auto"/>
+    <w:uiPriority w:val="9"/>
+    <w:semiHidden/>
+    <w:unhideWhenUsed/>
+    <w:qFormat/>
+    <w:rsid w:val="00FC693F"/>
+    <w:pPr>
+      <w:keepNext/>
+      <w:keepLines/>
+      <w:spacing w:before="200" w:after="0"/>
+      <w:outlineLvl w:val="2"/>
     </w:pPr>
     <w:rPr>
-      <w:rFonts w:ascii="Arial" w:hAnsi="Arial" w:cs="Arial" w:eastAsia="Arial"/>
-      <w:b w:val="0"/>
-      <w:bCs w:val="0"/>
-      <w:color w:val="434343"/>
-      <w:sz w:val="28"/>
-      <w:szCs w:val="28"/>
+      <w:b/>
+      <w:bCs/>
     </w:rPr>
   </w:style>
   <w:style w:type="paragraph" w:styleId="Heading4">
     <w:name w:val="heading 4"/>
     <w:basedOn w:val="Normal"/>
     <w:next w:val="Normal"/>
-    <w:pPr>
-      <w:keepNext w:val="1"/>
-      <w:keepLines w:val="1"/>
-      <w:pageBreakBefore w:val="0"/>
-      <w:spacing w:after="80" w:before="280" w:lineRule="auto"/>
+    <w:uiPriority w:val="9"/>
+    <w:semiHidden/>
+    <w:unhideWhenUsed/>
+    <w:qFormat/>
+    <w:pPr>
+      <w:keepNext/>
+      <w:keepLines/>
+      <w:spacing w:before="280" w:after="80"/>
+      <w:outlineLvl w:val="3"/>
     </w:pPr>
     <w:rPr>
-      <w:rFonts w:ascii="Arial" w:hAnsi="Arial" w:cs="Arial" w:eastAsia="Arial"/>
       <w:color w:val="666666"/>
       <w:sz w:val="24"/>
       <w:szCs w:val="24"/>
@@ -1081,52 +1423,91 @@
     <w:name w:val="heading 5"/>
     <w:basedOn w:val="Normal"/>
     <w:next w:val="Normal"/>
-    <w:pPr>
-      <w:keepNext w:val="1"/>
-      <w:keepLines w:val="1"/>
-      <w:pageBreakBefore w:val="0"/>
-      <w:spacing w:after="80" w:before="240" w:lineRule="auto"/>
+    <w:uiPriority w:val="9"/>
+    <w:semiHidden/>
+    <w:unhideWhenUsed/>
+    <w:qFormat/>
+    <w:pPr>
+      <w:keepNext/>
+      <w:keepLines/>
+      <w:spacing w:before="240" w:after="80"/>
+      <w:outlineLvl w:val="4"/>
     </w:pPr>
     <w:rPr>
-      <w:rFonts w:ascii="Arial" w:hAnsi="Arial" w:cs="Arial" w:eastAsia="Arial"/>
       <w:color w:val="666666"/>
-      <w:sz w:val="22"/>
-      <w:szCs w:val="22"/>
     </w:rPr>
   </w:style>
   <w:style w:type="paragraph" w:styleId="Heading6">
     <w:name w:val="heading 6"/>
     <w:basedOn w:val="Normal"/>
     <w:next w:val="Normal"/>
-    <w:pPr>
-      <w:keepNext w:val="1"/>
-      <w:keepLines w:val="1"/>
-      <w:pageBreakBefore w:val="0"/>
-      <w:spacing w:after="80" w:before="240" w:lineRule="auto"/>
+    <w:uiPriority w:val="9"/>
+    <w:semiHidden/>
+    <w:unhideWhenUsed/>
+    <w:qFormat/>
+    <w:pPr>
+      <w:keepNext/>
+      <w:keepLines/>
+      <w:spacing w:before="240" w:after="80"/>
+      <w:outlineLvl w:val="5"/>
     </w:pPr>
     <w:rPr>
-      <w:rFonts w:ascii="Arial" w:hAnsi="Arial" w:cs="Arial" w:eastAsia="Arial"/>
-      <w:i w:val="1"/>
-      <w:iCs w:val="1"/>
+      <w:i/>
+      <w:iCs/>
       <w:color w:val="666666"/>
-      <w:sz w:val="22"/>
-      <w:szCs w:val="22"/>
     </w:rPr>
+  </w:style>
+  <w:style w:type="character" w:default="1" w:styleId="DefaultParagraphFont">
+    <w:name w:val="Default Paragraph Font"/>
+    <w:uiPriority w:val="1"/>
+    <w:semiHidden/>
+    <w:unhideWhenUsed/>
+  </w:style>
+  <w:style w:type="table" w:default="1" w:styleId="TableNormal">
+    <w:name w:val="Normal Table"/>
+    <w:uiPriority w:val="99"/>
+    <w:semiHidden/>
+    <w:unhideWhenUsed/>
+    <w:tblPr>
+      <w:tblInd w:w="0" w:type="dxa"/>
+      <w:tblCellMar>
+        <w:top w:w="0" w:type="dxa"/>
+        <w:left w:w="108" w:type="dxa"/>
+        <w:bottom w:w="0" w:type="dxa"/>
+        <w:right w:w="108" w:type="dxa"/>
+      </w:tblCellMar>
+    </w:tblPr>
+  </w:style>
+  <w:style w:type="numbering" w:default="1" w:styleId="NoList">
+    <w:name w:val="No List"/>
+    <w:uiPriority w:val="99"/>
+    <w:semiHidden/>
+    <w:unhideWhenUsed/>
+  </w:style>
+  <w:style w:type="table" w:customStyle="1" w:styleId="TableNormal0">
+    <w:name w:val="TableNormal"/>
+    <w:tblPr>
+      <w:tblCellMar>
+        <w:top w:w="100" w:type="dxa"/>
+        <w:left w:w="100" w:type="dxa"/>
+        <w:bottom w:w="100" w:type="dxa"/>
+        <w:right w:w="100" w:type="dxa"/>
+      </w:tblCellMar>
+    </w:tblPr>
   </w:style>
   <w:style w:type="paragraph" w:styleId="Title">
     <w:name w:val="Title"/>
     <w:basedOn w:val="Normal"/>
     <w:next w:val="Normal"/>
-    <w:pPr>
-      <w:keepNext w:val="1"/>
-      <w:keepLines w:val="1"/>
-      <w:pageBreakBefore w:val="0"/>
-      <w:spacing w:after="120" w:before="0" w:lineRule="auto" w:line="264"/>
+    <w:uiPriority w:val="10"/>
+    <w:qFormat/>
+    <w:rsid w:val="00FC693F"/>
+    <w:pPr>
+      <w:spacing w:after="160" w:line="240" w:lineRule="auto"/>
+      <w:contextualSpacing/>
     </w:pPr>
     <w:rPr>
-      <w:rFonts w:ascii="Arial" w:hAnsi="Arial" w:cs="Arial" w:eastAsia="Arial"/>
-      <w:b/>
-      <w:color w:val="000000"/>
+      <w:kern w:val="28"/>
       <w:sz w:val="48"/>
       <w:szCs w:val="52"/>
     </w:rPr>
@@ -1135,44 +1516,105 @@
     <w:name w:val="Subtitle"/>
     <w:basedOn w:val="Normal"/>
     <w:next w:val="Normal"/>
-    <w:pPr>
-      <w:keepNext w:val="1"/>
-      <w:keepLines w:val="1"/>
-      <w:pageBreakBefore w:val="0"/>
-      <w:spacing w:after="120" w:before="0" w:lineRule="auto" w:line="264"/>
+    <w:uiPriority w:val="11"/>
+    <w:qFormat/>
+    <w:rsid w:val="00FC693F"/>
+    <w:pPr>
+      <w:numPr>
+        <w:ilvl w:val="1"/>
+      </w:numPr>
+      <w:spacing w:after="160"/>
     </w:pPr>
     <w:rPr>
-      <w:rFonts w:ascii="Arial" w:cs="Arial" w:eastAsia="Arial" w:hAnsi="Arial"/>
-      <w:b w:val="0"/>
-      <w:i w:val="0"/>
-      <w:iCs w:val="0"/>
-      <w:color w:val="000000"/>
-      <w:sz w:val="22"/>
-      <w:szCs w:val="30"/>
+      <w:iCs/>
+      <w:szCs w:val="24"/>
     </w:rPr>
   </w:style>
-  <w:style w:type="paragraph" w:customStyle="1" w:styleId="header">
-    <w:name w:val="header"/>
+  <w:style w:type="paragraph" w:customStyle="1" w:styleId="Header1">
+    <w:name w:val="Header1"/>
     <w:pPr>
       <w:spacing w:after="120" w:line="264" w:lineRule="auto"/>
     </w:pPr>
     <w:rPr>
-      <w:rFonts w:ascii="Arial" w:hAnsi="Arial" w:cs="Arial" w:eastAsia="Arial"/>
-      <w:b w:val="0"/>
       <w:color w:val="000000"/>
       <w:sz w:val="18"/>
     </w:rPr>
   </w:style>
-  <w:style w:type="paragraph" w:customStyle="1" w:styleId="footer">
-    <w:name w:val="footer"/>
+  <w:style w:type="paragraph" w:customStyle="1" w:styleId="Footer1">
+    <w:name w:val="Footer1"/>
     <w:pPr>
       <w:spacing w:after="120" w:line="264" w:lineRule="auto"/>
     </w:pPr>
     <w:rPr>
-      <w:rFonts w:ascii="Arial" w:hAnsi="Arial" w:cs="Arial" w:eastAsia="Arial"/>
-      <w:b w:val="0"/>
       <w:color w:val="000000"/>
       <w:sz w:val="18"/>
+    </w:rPr>
+  </w:style>
+  <w:style w:type="paragraph" w:styleId="Header">
+    <w:name w:val="header"/>
+    <w:basedOn w:val="Normal"/>
+    <w:uiPriority w:val="99"/>
+    <w:unhideWhenUsed/>
+    <w:rsid w:val="00E618BF"/>
+    <w:pPr>
+      <w:spacing w:after="0" w:line="240" w:lineRule="auto"/>
+    </w:pPr>
+  </w:style>
+  <w:style w:type="paragraph" w:styleId="Footer">
+    <w:name w:val="footer"/>
+    <w:basedOn w:val="Normal"/>
+    <w:uiPriority w:val="99"/>
+    <w:unhideWhenUsed/>
+    <w:rsid w:val="00E618BF"/>
+    <w:pPr>
+      <w:spacing w:after="0" w:line="240" w:lineRule="auto"/>
+    </w:pPr>
+    <w:rPr>
+      <w:sz w:val="18"/>
+    </w:rPr>
+  </w:style>
+  <w:style w:type="paragraph" w:styleId="ListBullet">
+    <w:name w:val="List Bullet"/>
+    <w:basedOn w:val="Normal"/>
+    <w:uiPriority w:val="99"/>
+    <w:unhideWhenUsed/>
+    <w:rsid w:val="00326F90"/>
+    <w:pPr>
+      <w:numPr>
+        <w:numId w:val="1"/>
+      </w:numPr>
+      <w:contextualSpacing/>
+    </w:pPr>
+  </w:style>
+  <w:style w:type="paragraph" w:styleId="ListNumber">
+    <w:name w:val="List Number"/>
+    <w:basedOn w:val="Normal"/>
+    <w:uiPriority w:val="99"/>
+    <w:unhideWhenUsed/>
+    <w:rsid w:val="00326F90"/>
+    <w:pPr>
+      <w:numPr>
+        <w:numId w:val="4"/>
+      </w:numPr>
+      <w:contextualSpacing/>
+    </w:pPr>
+  </w:style>
+  <w:style w:type="paragraph" w:styleId="Caption">
+    <w:name w:val="caption"/>
+    <w:basedOn w:val="Normal"/>
+    <w:next w:val="Normal"/>
+    <w:uiPriority w:val="35"/>
+    <w:semiHidden/>
+    <w:unhideWhenUsed/>
+    <w:qFormat/>
+    <w:rsid w:val="00FC693F"/>
+    <w:pPr>
+      <w:spacing w:line="240" w:lineRule="auto"/>
+    </w:pPr>
+    <w:rPr>
+      <w:bCs/>
+      <w:sz w:val="20"/>
+      <w:szCs w:val="18"/>
     </w:rPr>
   </w:style>
 </w:styles>

</xml_diff>